<commit_message>
update notes from course and add book notes
</commit_message>
<xml_diff>
--- a/Notes.docx
+++ b/Notes.docx
@@ -6729,7 +6729,7 @@
         </w:rPr>
         <w:lastRenderedPageBreak/>
         <w:pict w14:anchorId="54A79A92">
-          <v:rect id="_x0000_i1065" style="width:0;height:1.5pt" o:hralign="center" o:hrstd="t" o:hr="t" fillcolor="#a0a0a0" stroked="f"/>
+          <v:rect id="_x0000_i1025" style="width:0;height:1.5pt" o:hralign="center" o:hrstd="t" o:hr="t" fillcolor="#a0a0a0" stroked="f"/>
         </w:pict>
       </w:r>
     </w:p>
@@ -6832,7 +6832,7 @@
           <w:szCs w:val="22"/>
         </w:rPr>
         <w:pict w14:anchorId="3CE1C23C">
-          <v:rect id="_x0000_i1066" style="width:0;height:1.5pt" o:hralign="center" o:hrstd="t" o:hr="t" fillcolor="#a0a0a0" stroked="f"/>
+          <v:rect id="_x0000_i1026" style="width:0;height:1.5pt" o:hralign="center" o:hrstd="t" o:hr="t" fillcolor="#a0a0a0" stroked="f"/>
         </w:pict>
       </w:r>
     </w:p>
@@ -7097,6 +7097,497 @@
         <w:br/>
         <w:t>) t;</w:t>
       </w:r>
+    </w:p>
+    <w:p>
+      <w:pPr>
+        <w:rPr>
+          <w:color w:val="000000" w:themeColor="text1"/>
+          <w:sz w:val="22"/>
+          <w:szCs w:val="22"/>
+        </w:rPr>
+      </w:pPr>
+    </w:p>
+    <w:p>
+      <w:pPr>
+        <w:rPr>
+          <w:b/>
+          <w:bCs/>
+          <w:color w:val="EE0000"/>
+          <w:sz w:val="32"/>
+          <w:szCs w:val="32"/>
+          <w:u w:val="single"/>
+        </w:rPr>
+      </w:pPr>
+    </w:p>
+    <w:p>
+      <w:pPr>
+        <w:rPr>
+          <w:b/>
+          <w:bCs/>
+          <w:color w:val="EE0000"/>
+          <w:sz w:val="32"/>
+          <w:szCs w:val="32"/>
+          <w:u w:val="single"/>
+        </w:rPr>
+      </w:pPr>
+    </w:p>
+    <w:p>
+      <w:pPr>
+        <w:rPr>
+          <w:b/>
+          <w:bCs/>
+          <w:color w:val="EE0000"/>
+          <w:sz w:val="32"/>
+          <w:szCs w:val="32"/>
+          <w:u w:val="single"/>
+        </w:rPr>
+      </w:pPr>
+    </w:p>
+    <w:p>
+      <w:pPr>
+        <w:rPr>
+          <w:b/>
+          <w:bCs/>
+          <w:color w:val="EE0000"/>
+          <w:sz w:val="32"/>
+          <w:szCs w:val="32"/>
+          <w:u w:val="single"/>
+        </w:rPr>
+      </w:pPr>
+    </w:p>
+    <w:p>
+      <w:pPr>
+        <w:rPr>
+          <w:b/>
+          <w:bCs/>
+          <w:color w:val="EE0000"/>
+          <w:sz w:val="32"/>
+          <w:szCs w:val="32"/>
+          <w:u w:val="single"/>
+        </w:rPr>
+      </w:pPr>
+    </w:p>
+    <w:p>
+      <w:pPr>
+        <w:rPr>
+          <w:b/>
+          <w:bCs/>
+          <w:color w:val="EE0000"/>
+          <w:sz w:val="32"/>
+          <w:szCs w:val="32"/>
+          <w:u w:val="single"/>
+        </w:rPr>
+      </w:pPr>
+    </w:p>
+    <w:p>
+      <w:pPr>
+        <w:rPr>
+          <w:b/>
+          <w:bCs/>
+          <w:color w:val="EE0000"/>
+          <w:sz w:val="32"/>
+          <w:szCs w:val="32"/>
+          <w:u w:val="single"/>
+        </w:rPr>
+      </w:pPr>
+    </w:p>
+    <w:p>
+      <w:pPr>
+        <w:rPr>
+          <w:b/>
+          <w:bCs/>
+          <w:color w:val="EE0000"/>
+          <w:sz w:val="32"/>
+          <w:szCs w:val="32"/>
+          <w:u w:val="single"/>
+        </w:rPr>
+      </w:pPr>
+    </w:p>
+    <w:p>
+      <w:pPr>
+        <w:jc w:val="center"/>
+        <w:rPr>
+          <w:b/>
+          <w:bCs/>
+          <w:color w:val="EE0000"/>
+          <w:sz w:val="32"/>
+          <w:szCs w:val="32"/>
+          <w:u w:val="single"/>
+        </w:rPr>
+      </w:pPr>
+      <w:r>
+        <w:rPr>
+          <w:b/>
+          <w:bCs/>
+          <w:color w:val="EE0000"/>
+          <w:sz w:val="32"/>
+          <w:szCs w:val="32"/>
+          <w:u w:val="single"/>
+        </w:rPr>
+        <w:lastRenderedPageBreak/>
+        <w:t>ON DELETE</w:t>
+      </w:r>
+    </w:p>
+    <w:p>
+      <w:pPr>
+        <w:rPr>
+          <w:color w:val="000000" w:themeColor="text1"/>
+          <w:sz w:val="22"/>
+          <w:szCs w:val="22"/>
+        </w:rPr>
+      </w:pPr>
+      <w:r>
+        <w:rPr>
+          <w:color w:val="000000" w:themeColor="text1"/>
+          <w:sz w:val="22"/>
+          <w:szCs w:val="22"/>
+        </w:rPr>
+        <w:t xml:space="preserve">In SQL, </w:t>
+      </w:r>
+      <w:r>
+        <w:rPr>
+          <w:color w:val="EE0000"/>
+          <w:sz w:val="22"/>
+          <w:szCs w:val="22"/>
+        </w:rPr>
+        <w:t xml:space="preserve">ON DELETE </w:t>
+      </w:r>
+      <w:r>
+        <w:rPr>
+          <w:color w:val="000000" w:themeColor="text1"/>
+          <w:sz w:val="22"/>
+          <w:szCs w:val="22"/>
+        </w:rPr>
+        <w:t>is a clause used in foreign key constraints to define referential actions—i.e., what the database should do to dependent (child) rows when a referenced (parent) row is deleted.</w:t>
+      </w:r>
+      <w:r>
+        <w:rPr>
+          <w:color w:val="000000" w:themeColor="text1"/>
+          <w:sz w:val="22"/>
+          <w:szCs w:val="22"/>
+        </w:rPr>
+        <w:t xml:space="preserve">  </w:t>
+      </w:r>
+    </w:p>
+    <w:p>
+      <w:pPr>
+        <w:rPr>
+          <w:color w:val="EE0000"/>
+          <w:sz w:val="22"/>
+          <w:szCs w:val="22"/>
+        </w:rPr>
+      </w:pPr>
+      <w:r>
+        <w:rPr>
+          <w:color w:val="EE0000"/>
+          <w:sz w:val="22"/>
+          <w:szCs w:val="22"/>
+        </w:rPr>
+        <w:t>ON DELETE CASCADE</w:t>
+      </w:r>
+    </w:p>
+    <w:p>
+      <w:pPr>
+        <w:rPr>
+          <w:color w:val="000000" w:themeColor="text1"/>
+          <w:sz w:val="22"/>
+          <w:szCs w:val="22"/>
+        </w:rPr>
+      </w:pPr>
+      <w:r>
+        <w:rPr>
+          <w:color w:val="000000" w:themeColor="text1"/>
+          <w:sz w:val="22"/>
+          <w:szCs w:val="22"/>
+        </w:rPr>
+        <w:t>When a parent row is deleted, all related child rows are automatically deleted.</w:t>
+      </w:r>
+      <w:r>
+        <w:rPr>
+          <w:color w:val="000000" w:themeColor="text1"/>
+          <w:sz w:val="22"/>
+          <w:szCs w:val="22"/>
+        </w:rPr>
+        <w:t xml:space="preserve"> For </w:t>
+      </w:r>
+      <w:proofErr w:type="gramStart"/>
+      <w:r>
+        <w:rPr>
+          <w:color w:val="000000" w:themeColor="text1"/>
+          <w:sz w:val="22"/>
+          <w:szCs w:val="22"/>
+        </w:rPr>
+        <w:t>instance</w:t>
+      </w:r>
+      <w:proofErr w:type="gramEnd"/>
+      <w:r>
+        <w:rPr>
+          <w:color w:val="000000" w:themeColor="text1"/>
+          <w:sz w:val="22"/>
+          <w:szCs w:val="22"/>
+        </w:rPr>
+        <w:t xml:space="preserve"> imagine we have a table called customers and this table has a column called customer id, now </w:t>
+      </w:r>
+      <w:proofErr w:type="gramStart"/>
+      <w:r>
+        <w:rPr>
+          <w:color w:val="000000" w:themeColor="text1"/>
+          <w:sz w:val="22"/>
+          <w:szCs w:val="22"/>
+        </w:rPr>
+        <w:t>lets</w:t>
+      </w:r>
+      <w:proofErr w:type="gramEnd"/>
+      <w:r>
+        <w:rPr>
+          <w:color w:val="000000" w:themeColor="text1"/>
+          <w:sz w:val="22"/>
+          <w:szCs w:val="22"/>
+        </w:rPr>
+        <w:t xml:space="preserve"> say we have another table called orders which uses this id as a foreign key, </w:t>
+      </w:r>
+    </w:p>
+    <w:p>
+      <w:pPr>
+        <w:rPr>
+          <w:color w:val="000000" w:themeColor="text1"/>
+          <w:sz w:val="22"/>
+          <w:szCs w:val="22"/>
+        </w:rPr>
+      </w:pPr>
+      <w:r>
+        <w:rPr>
+          <w:color w:val="000000" w:themeColor="text1"/>
+          <w:sz w:val="22"/>
+          <w:szCs w:val="22"/>
+        </w:rPr>
+        <w:t xml:space="preserve">So </w:t>
+      </w:r>
+      <w:r>
+        <w:rPr>
+          <w:color w:val="EE0000"/>
+          <w:sz w:val="22"/>
+          <w:szCs w:val="22"/>
+        </w:rPr>
+        <w:t>FOREIGN KEY (</w:t>
+      </w:r>
+      <w:proofErr w:type="spellStart"/>
+      <w:r>
+        <w:rPr>
+          <w:color w:val="EE0000"/>
+          <w:sz w:val="22"/>
+          <w:szCs w:val="22"/>
+        </w:rPr>
+        <w:t>customer_id</w:t>
+      </w:r>
+      <w:proofErr w:type="spellEnd"/>
+      <w:r>
+        <w:rPr>
+          <w:color w:val="EE0000"/>
+          <w:sz w:val="22"/>
+          <w:szCs w:val="22"/>
+        </w:rPr>
+        <w:t>) REFRENCES customer(id) ON DELETE CASCAD</w:t>
+      </w:r>
+      <w:r>
+        <w:rPr>
+          <w:color w:val="000000" w:themeColor="text1"/>
+          <w:sz w:val="22"/>
+          <w:szCs w:val="22"/>
+        </w:rPr>
+        <w:t>E. Deletes every row in the orders table ones an entry of the foreign key is deleted in the parent table</w:t>
+      </w:r>
+    </w:p>
+    <w:p>
+      <w:pPr>
+        <w:rPr>
+          <w:color w:val="000000" w:themeColor="text1"/>
+          <w:sz w:val="22"/>
+          <w:szCs w:val="22"/>
+        </w:rPr>
+      </w:pPr>
+    </w:p>
+    <w:p>
+      <w:pPr>
+        <w:rPr>
+          <w:color w:val="000000" w:themeColor="text1"/>
+          <w:sz w:val="22"/>
+          <w:szCs w:val="22"/>
+        </w:rPr>
+      </w:pPr>
+      <w:r>
+        <w:rPr>
+          <w:color w:val="EE0000"/>
+          <w:sz w:val="22"/>
+          <w:szCs w:val="22"/>
+        </w:rPr>
+        <w:t xml:space="preserve">ON DELETE SET </w:t>
+      </w:r>
+      <w:proofErr w:type="gramStart"/>
+      <w:r>
+        <w:rPr>
+          <w:color w:val="EE0000"/>
+          <w:sz w:val="22"/>
+          <w:szCs w:val="22"/>
+        </w:rPr>
+        <w:t xml:space="preserve">NULL; </w:t>
+      </w:r>
+      <w:r>
+        <w:rPr>
+          <w:color w:val="EE0000"/>
+          <w:sz w:val="22"/>
+          <w:szCs w:val="22"/>
+        </w:rPr>
+        <w:t xml:space="preserve"> </w:t>
+      </w:r>
+      <w:r>
+        <w:rPr>
+          <w:color w:val="000000" w:themeColor="text1"/>
+          <w:sz w:val="22"/>
+          <w:szCs w:val="22"/>
+        </w:rPr>
+        <w:t>sets</w:t>
+      </w:r>
+      <w:proofErr w:type="gramEnd"/>
+      <w:r>
+        <w:rPr>
+          <w:color w:val="000000" w:themeColor="text1"/>
+          <w:sz w:val="22"/>
+          <w:szCs w:val="22"/>
+        </w:rPr>
+        <w:t xml:space="preserve"> the foreign key into NULL once its entry is deleted in the parent table</w:t>
+      </w:r>
+    </w:p>
+    <w:p>
+      <w:pPr>
+        <w:rPr>
+          <w:color w:val="000000" w:themeColor="text1"/>
+          <w:sz w:val="22"/>
+          <w:szCs w:val="22"/>
+        </w:rPr>
+      </w:pPr>
+    </w:p>
+    <w:p>
+      <w:pPr>
+        <w:rPr>
+          <w:color w:val="000000" w:themeColor="text1"/>
+          <w:sz w:val="22"/>
+          <w:szCs w:val="22"/>
+        </w:rPr>
+      </w:pPr>
+      <w:r>
+        <w:rPr>
+          <w:color w:val="EE0000"/>
+          <w:sz w:val="22"/>
+          <w:szCs w:val="22"/>
+        </w:rPr>
+        <w:t>ON DELETE SET DEFAULT;</w:t>
+      </w:r>
+      <w:r>
+        <w:rPr>
+          <w:color w:val="000000" w:themeColor="text1"/>
+          <w:sz w:val="22"/>
+          <w:szCs w:val="22"/>
+        </w:rPr>
+        <w:t xml:space="preserve"> it only works if the foreign key has a value</w:t>
+      </w:r>
+    </w:p>
+    <w:p>
+      <w:pPr>
+        <w:rPr>
+          <w:color w:val="000000" w:themeColor="text1"/>
+          <w:sz w:val="22"/>
+          <w:szCs w:val="22"/>
+        </w:rPr>
+      </w:pPr>
+      <w:r>
+        <w:rPr>
+          <w:color w:val="EE0000"/>
+          <w:sz w:val="22"/>
+          <w:szCs w:val="22"/>
+        </w:rPr>
+        <w:t>ON DELETE RESTRICT;</w:t>
+      </w:r>
+      <w:r>
+        <w:rPr>
+          <w:color w:val="000000" w:themeColor="text1"/>
+          <w:sz w:val="22"/>
+          <w:szCs w:val="22"/>
+        </w:rPr>
+        <w:t xml:space="preserve"> it is used in critical and financial systems to prevents deletion from happening</w:t>
+      </w:r>
+    </w:p>
+    <w:p>
+      <w:pPr>
+        <w:rPr>
+          <w:color w:val="000000" w:themeColor="text1"/>
+          <w:sz w:val="22"/>
+          <w:szCs w:val="22"/>
+        </w:rPr>
+      </w:pPr>
+    </w:p>
+    <w:p>
+      <w:pPr>
+        <w:rPr>
+          <w:color w:val="000000" w:themeColor="text1"/>
+          <w:sz w:val="22"/>
+          <w:szCs w:val="22"/>
+        </w:rPr>
+      </w:pPr>
+    </w:p>
+    <w:p>
+      <w:pPr>
+        <w:rPr>
+          <w:color w:val="000000" w:themeColor="text1"/>
+          <w:sz w:val="22"/>
+          <w:szCs w:val="22"/>
+        </w:rPr>
+      </w:pPr>
+    </w:p>
+    <w:p>
+      <w:pPr>
+        <w:rPr>
+          <w:color w:val="000000" w:themeColor="text1"/>
+          <w:sz w:val="22"/>
+          <w:szCs w:val="22"/>
+        </w:rPr>
+      </w:pPr>
+    </w:p>
+    <w:p>
+      <w:pPr>
+        <w:rPr>
+          <w:color w:val="000000" w:themeColor="text1"/>
+          <w:sz w:val="22"/>
+          <w:szCs w:val="22"/>
+        </w:rPr>
+      </w:pPr>
+    </w:p>
+    <w:p>
+      <w:pPr>
+        <w:rPr>
+          <w:color w:val="000000" w:themeColor="text1"/>
+          <w:sz w:val="22"/>
+          <w:szCs w:val="22"/>
+        </w:rPr>
+      </w:pPr>
+    </w:p>
+    <w:p>
+      <w:pPr>
+        <w:rPr>
+          <w:color w:val="000000" w:themeColor="text1"/>
+          <w:sz w:val="22"/>
+          <w:szCs w:val="22"/>
+        </w:rPr>
+      </w:pPr>
+    </w:p>
+    <w:p>
+      <w:pPr>
+        <w:rPr>
+          <w:color w:val="000000" w:themeColor="text1"/>
+          <w:sz w:val="22"/>
+          <w:szCs w:val="22"/>
+        </w:rPr>
+      </w:pPr>
     </w:p>
     <w:p>
       <w:pPr>
@@ -7115,6 +7606,56 @@
     </w:sectPr>
   </w:body>
 </w:document>
+</file>
+
+<file path=word/endnotes.xml><?xml version="1.0" encoding="utf-8"?>
+<w:endnotes xmlns:wpc="http://schemas.microsoft.com/office/word/2010/wordprocessingCanvas" xmlns:cx="http://schemas.microsoft.com/office/drawing/2014/chartex" xmlns:cx1="http://schemas.microsoft.com/office/drawing/2015/9/8/chartex" xmlns:cx2="http://schemas.microsoft.com/office/drawing/2015/10/21/chartex" xmlns:cx3="http://schemas.microsoft.com/office/drawing/2016/5/9/chartex" xmlns:cx4="http://schemas.microsoft.com/office/drawing/2016/5/10/chartex" xmlns:cx5="http://schemas.microsoft.com/office/drawing/2016/5/11/chartex" xmlns:cx6="http://schemas.microsoft.com/office/drawing/2016/5/12/chartex" xmlns:cx7="http://schemas.microsoft.com/office/drawing/2016/5/13/chartex" xmlns:cx8="http://schemas.microsoft.com/office/drawing/2016/5/14/chartex" xmlns:mc="http://schemas.openxmlformats.org/markup-compatibility/2006" xmlns:aink="http://schemas.microsoft.com/office/drawing/2016/ink" xmlns:am3d="http://schemas.microsoft.com/office/drawing/2017/model3d" xmlns:o="urn:schemas-microsoft-com:office:office" xmlns:oel="http://schemas.microsoft.com/office/2019/extlst" xmlns:r="http://schemas.openxmlformats.org/officeDocument/2006/relationships" xmlns:m="http://schemas.openxmlformats.org/officeDocument/2006/math" xmlns:v="urn:schemas-microsoft-com:vml" xmlns:wp14="http://schemas.microsoft.com/office/word/2010/wordprocessingDrawing" xmlns:wp="http://schemas.openxmlformats.org/drawingml/2006/wordprocessingDrawing" xmlns:w10="urn:schemas-microsoft-com:office:word" xmlns:w="http://schemas.openxmlformats.org/wordprocessingml/2006/main" xmlns:w14="http://schemas.microsoft.com/office/word/2010/wordml" xmlns:w15="http://schemas.microsoft.com/office/word/2012/wordml" xmlns:w16cex="http://schemas.microsoft.com/office/word/2018/wordml/cex" xmlns:w16cid="http://schemas.microsoft.com/office/word/2016/wordml/cid" xmlns:w16="http://schemas.microsoft.com/office/word/2018/wordml" xmlns:w16du="http://schemas.microsoft.com/office/word/2023/wordml/word16du" xmlns:w16sdtdh="http://schemas.microsoft.com/office/word/2020/wordml/sdtdatahash" xmlns:w16sdtfl="http://schemas.microsoft.com/office/word/2024/wordml/sdtformatlock" xmlns:w16se="http://schemas.microsoft.com/office/word/2015/wordml/symex" xmlns:wpg="http://schemas.microsoft.com/office/word/2010/wordprocessingGroup" xmlns:wpi="http://schemas.microsoft.com/office/word/2010/wordprocessingInk" xmlns:wne="http://schemas.microsoft.com/office/word/2006/wordml" xmlns:wps="http://schemas.microsoft.com/office/word/2010/wordprocessingShape" mc:Ignorable="w14 w15 w16se w16cid w16 w16cex w16sdtdh w16sdtfl w16du wp14">
+  <w:endnote w:type="separator" w:id="-1">
+    <w:p>
+      <w:pPr>
+        <w:spacing w:after="0" w:line="240" w:lineRule="auto"/>
+      </w:pPr>
+      <w:r>
+        <w:separator/>
+      </w:r>
+    </w:p>
+  </w:endnote>
+  <w:endnote w:type="continuationSeparator" w:id="0">
+    <w:p>
+      <w:pPr>
+        <w:spacing w:after="0" w:line="240" w:lineRule="auto"/>
+      </w:pPr>
+      <w:r>
+        <w:continuationSeparator/>
+      </w:r>
+    </w:p>
+  </w:endnote>
+</w:endnotes>
+</file>
+
+<file path=word/footnotes.xml><?xml version="1.0" encoding="utf-8"?>
+<w:footnotes xmlns:wpc="http://schemas.microsoft.com/office/word/2010/wordprocessingCanvas" xmlns:cx="http://schemas.microsoft.com/office/drawing/2014/chartex" xmlns:cx1="http://schemas.microsoft.com/office/drawing/2015/9/8/chartex" xmlns:cx2="http://schemas.microsoft.com/office/drawing/2015/10/21/chartex" xmlns:cx3="http://schemas.microsoft.com/office/drawing/2016/5/9/chartex" xmlns:cx4="http://schemas.microsoft.com/office/drawing/2016/5/10/chartex" xmlns:cx5="http://schemas.microsoft.com/office/drawing/2016/5/11/chartex" xmlns:cx6="http://schemas.microsoft.com/office/drawing/2016/5/12/chartex" xmlns:cx7="http://schemas.microsoft.com/office/drawing/2016/5/13/chartex" xmlns:cx8="http://schemas.microsoft.com/office/drawing/2016/5/14/chartex" xmlns:mc="http://schemas.openxmlformats.org/markup-compatibility/2006" xmlns:aink="http://schemas.microsoft.com/office/drawing/2016/ink" xmlns:am3d="http://schemas.microsoft.com/office/drawing/2017/model3d" xmlns:o="urn:schemas-microsoft-com:office:office" xmlns:oel="http://schemas.microsoft.com/office/2019/extlst" xmlns:r="http://schemas.openxmlformats.org/officeDocument/2006/relationships" xmlns:m="http://schemas.openxmlformats.org/officeDocument/2006/math" xmlns:v="urn:schemas-microsoft-com:vml" xmlns:wp14="http://schemas.microsoft.com/office/word/2010/wordprocessingDrawing" xmlns:wp="http://schemas.openxmlformats.org/drawingml/2006/wordprocessingDrawing" xmlns:w10="urn:schemas-microsoft-com:office:word" xmlns:w="http://schemas.openxmlformats.org/wordprocessingml/2006/main" xmlns:w14="http://schemas.microsoft.com/office/word/2010/wordml" xmlns:w15="http://schemas.microsoft.com/office/word/2012/wordml" xmlns:w16cex="http://schemas.microsoft.com/office/word/2018/wordml/cex" xmlns:w16cid="http://schemas.microsoft.com/office/word/2016/wordml/cid" xmlns:w16="http://schemas.microsoft.com/office/word/2018/wordml" xmlns:w16du="http://schemas.microsoft.com/office/word/2023/wordml/word16du" xmlns:w16sdtdh="http://schemas.microsoft.com/office/word/2020/wordml/sdtdatahash" xmlns:w16sdtfl="http://schemas.microsoft.com/office/word/2024/wordml/sdtformatlock" xmlns:w16se="http://schemas.microsoft.com/office/word/2015/wordml/symex" xmlns:wpg="http://schemas.microsoft.com/office/word/2010/wordprocessingGroup" xmlns:wpi="http://schemas.microsoft.com/office/word/2010/wordprocessingInk" xmlns:wne="http://schemas.microsoft.com/office/word/2006/wordml" xmlns:wps="http://schemas.microsoft.com/office/word/2010/wordprocessingShape" mc:Ignorable="w14 w15 w16se w16cid w16 w16cex w16sdtdh w16sdtfl w16du wp14">
+  <w:footnote w:type="separator" w:id="-1">
+    <w:p>
+      <w:pPr>
+        <w:spacing w:after="0" w:line="240" w:lineRule="auto"/>
+      </w:pPr>
+      <w:r>
+        <w:separator/>
+      </w:r>
+    </w:p>
+  </w:footnote>
+  <w:footnote w:type="continuationSeparator" w:id="0">
+    <w:p>
+      <w:pPr>
+        <w:spacing w:after="0" w:line="240" w:lineRule="auto"/>
+      </w:pPr>
+      <w:r>
+        <w:continuationSeparator/>
+      </w:r>
+    </w:p>
+  </w:footnote>
+</w:footnotes>
 </file>
 
 <file path=word/numbering.xml><?xml version="1.0" encoding="utf-8"?>
@@ -9382,6 +9923,50 @@
       <w:spacing w:val="5"/>
     </w:rPr>
   </w:style>
+  <w:style w:type="paragraph" w:styleId="Header">
+    <w:name w:val="header"/>
+    <w:basedOn w:val="Normal"/>
+    <w:link w:val="HeaderChar"/>
+    <w:uiPriority w:val="99"/>
+    <w:unhideWhenUsed/>
+    <w:rsid w:val="00596FDA"/>
+    <w:pPr>
+      <w:tabs>
+        <w:tab w:val="center" w:pos="4320"/>
+        <w:tab w:val="right" w:pos="8640"/>
+      </w:tabs>
+      <w:spacing w:after="0" w:line="240" w:lineRule="auto"/>
+    </w:pPr>
+  </w:style>
+  <w:style w:type="character" w:customStyle="1" w:styleId="HeaderChar">
+    <w:name w:val="Header Char"/>
+    <w:basedOn w:val="DefaultParagraphFont"/>
+    <w:link w:val="Header"/>
+    <w:uiPriority w:val="99"/>
+    <w:rsid w:val="00596FDA"/>
+  </w:style>
+  <w:style w:type="paragraph" w:styleId="Footer">
+    <w:name w:val="footer"/>
+    <w:basedOn w:val="Normal"/>
+    <w:link w:val="FooterChar"/>
+    <w:uiPriority w:val="99"/>
+    <w:unhideWhenUsed/>
+    <w:rsid w:val="00596FDA"/>
+    <w:pPr>
+      <w:tabs>
+        <w:tab w:val="center" w:pos="4320"/>
+        <w:tab w:val="right" w:pos="8640"/>
+      </w:tabs>
+      <w:spacing w:after="0" w:line="240" w:lineRule="auto"/>
+    </w:pPr>
+  </w:style>
+  <w:style w:type="character" w:customStyle="1" w:styleId="FooterChar">
+    <w:name w:val="Footer Char"/>
+    <w:basedOn w:val="DefaultParagraphFont"/>
+    <w:link w:val="Footer"/>
+    <w:uiPriority w:val="99"/>
+    <w:rsid w:val="00596FDA"/>
+  </w:style>
 </w:styles>
 </file>
 

</xml_diff>

<commit_message>
add er notes from the yt course
</commit_message>
<xml_diff>
--- a/Notes.docx
+++ b/Notes.docx
@@ -715,23 +715,13 @@
           <w:szCs w:val="22"/>
         </w:rPr>
       </w:pPr>
-      <w:proofErr w:type="spellStart"/>
-      <w:r>
-        <w:rPr>
-          <w:color w:val="000000" w:themeColor="text1"/>
-          <w:sz w:val="22"/>
-          <w:szCs w:val="22"/>
-        </w:rPr>
-        <w:t>Sql</w:t>
-      </w:r>
-      <w:proofErr w:type="spellEnd"/>
-      <w:r>
-        <w:rPr>
-          <w:color w:val="000000" w:themeColor="text1"/>
-          <w:sz w:val="22"/>
-          <w:szCs w:val="22"/>
-        </w:rPr>
-        <w:t xml:space="preserve"> is data (query, definition, control, manipulation)</w:t>
+      <w:r>
+        <w:rPr>
+          <w:color w:val="000000" w:themeColor="text1"/>
+          <w:sz w:val="22"/>
+          <w:szCs w:val="22"/>
+        </w:rPr>
+        <w:t>Sql is data (query, definition, control, manipulation)</w:t>
       </w:r>
     </w:p>
     <w:p>
@@ -824,25 +814,7 @@
           <w:sz w:val="22"/>
           <w:szCs w:val="22"/>
         </w:rPr>
-        <w:t>DECIMAL(</w:t>
-      </w:r>
-      <w:proofErr w:type="gramStart"/>
-      <w:r>
-        <w:rPr>
-          <w:color w:val="000000" w:themeColor="text1"/>
-          <w:sz w:val="22"/>
-          <w:szCs w:val="22"/>
-        </w:rPr>
-        <w:t>M,N</w:t>
-      </w:r>
-      <w:proofErr w:type="gramEnd"/>
-      <w:r>
-        <w:rPr>
-          <w:color w:val="000000" w:themeColor="text1"/>
-          <w:sz w:val="22"/>
-          <w:szCs w:val="22"/>
-        </w:rPr>
-        <w:t xml:space="preserve">) </w:t>
+        <w:t xml:space="preserve">DECIMAL(M,N) </w:t>
       </w:r>
       <w:r>
         <w:rPr>
@@ -869,23 +841,13 @@
           <w:szCs w:val="22"/>
         </w:rPr>
       </w:pPr>
-      <w:proofErr w:type="gramStart"/>
-      <w:r>
-        <w:rPr>
-          <w:color w:val="000000" w:themeColor="text1"/>
-          <w:sz w:val="22"/>
-          <w:szCs w:val="22"/>
-        </w:rPr>
-        <w:t>VARCHAR(</w:t>
-      </w:r>
-      <w:proofErr w:type="gramEnd"/>
-      <w:r>
-        <w:rPr>
-          <w:color w:val="000000" w:themeColor="text1"/>
-          <w:sz w:val="22"/>
-          <w:szCs w:val="22"/>
-        </w:rPr>
-        <w:t xml:space="preserve">size) </w:t>
+      <w:r>
+        <w:rPr>
+          <w:color w:val="000000" w:themeColor="text1"/>
+          <w:sz w:val="22"/>
+          <w:szCs w:val="22"/>
+        </w:rPr>
+        <w:t xml:space="preserve">VARCHAR(size) </w:t>
       </w:r>
       <w:r>
         <w:rPr>
@@ -1068,44 +1030,58 @@
           <w:sz w:val="22"/>
           <w:szCs w:val="22"/>
         </w:rPr>
-        <w:t xml:space="preserve">CREATE TABLE </w:t>
-      </w:r>
-      <w:proofErr w:type="gramStart"/>
-      <w:r>
-        <w:rPr>
-          <w:color w:val="EE0000"/>
-          <w:sz w:val="22"/>
-          <w:szCs w:val="22"/>
-        </w:rPr>
-        <w:t>name(</w:t>
-      </w:r>
-      <w:proofErr w:type="gramEnd"/>
-      <w:r>
-        <w:rPr>
-          <w:color w:val="EE0000"/>
-          <w:sz w:val="22"/>
-          <w:szCs w:val="22"/>
-        </w:rPr>
-        <w:t>);</w:t>
-      </w:r>
-    </w:p>
-    <w:p>
-      <w:pPr>
-        <w:rPr>
-          <w:color w:val="000000" w:themeColor="text1"/>
-          <w:sz w:val="22"/>
-          <w:szCs w:val="22"/>
-        </w:rPr>
-      </w:pPr>
-      <w:r>
-        <w:rPr>
-          <w:color w:val="EE0000"/>
-          <w:sz w:val="22"/>
-          <w:szCs w:val="22"/>
-        </w:rPr>
-        <w:t xml:space="preserve">DESCRIBE </w:t>
-      </w:r>
-      <w:proofErr w:type="gramStart"/>
+        <w:t>CREATE TABLE name();</w:t>
+      </w:r>
+    </w:p>
+    <w:p>
+      <w:pPr>
+        <w:rPr>
+          <w:color w:val="000000" w:themeColor="text1"/>
+          <w:sz w:val="22"/>
+          <w:szCs w:val="22"/>
+        </w:rPr>
+      </w:pPr>
+      <w:r>
+        <w:rPr>
+          <w:color w:val="EE0000"/>
+          <w:sz w:val="22"/>
+          <w:szCs w:val="22"/>
+        </w:rPr>
+        <w:t>DESCRIBE name;</w:t>
+      </w:r>
+      <w:r>
+        <w:rPr>
+          <w:color w:val="000000" w:themeColor="text1"/>
+          <w:sz w:val="22"/>
+          <w:szCs w:val="22"/>
+        </w:rPr>
+        <w:t xml:space="preserve">  this command describes a table</w:t>
+      </w:r>
+    </w:p>
+    <w:p>
+      <w:pPr>
+        <w:rPr>
+          <w:color w:val="000000" w:themeColor="text1"/>
+          <w:sz w:val="22"/>
+          <w:szCs w:val="22"/>
+        </w:rPr>
+      </w:pPr>
+      <w:r>
+        <w:rPr>
+          <w:color w:val="EE0000"/>
+          <w:sz w:val="22"/>
+          <w:szCs w:val="22"/>
+        </w:rPr>
+        <w:t xml:space="preserve">DROP </w:t>
+      </w:r>
+      <w:r>
+        <w:rPr>
+          <w:color w:val="EE0000"/>
+          <w:sz w:val="22"/>
+          <w:szCs w:val="22"/>
+        </w:rPr>
+        <w:t xml:space="preserve">TABLE </w:t>
+      </w:r>
       <w:r>
         <w:rPr>
           <w:color w:val="EE0000"/>
@@ -1120,56 +1096,6 @@
           <w:sz w:val="22"/>
           <w:szCs w:val="22"/>
         </w:rPr>
-        <w:t xml:space="preserve">  this</w:t>
-      </w:r>
-      <w:proofErr w:type="gramEnd"/>
-      <w:r>
-        <w:rPr>
-          <w:color w:val="000000" w:themeColor="text1"/>
-          <w:sz w:val="22"/>
-          <w:szCs w:val="22"/>
-        </w:rPr>
-        <w:t xml:space="preserve"> command describes a table</w:t>
-      </w:r>
-    </w:p>
-    <w:p>
-      <w:pPr>
-        <w:rPr>
-          <w:color w:val="000000" w:themeColor="text1"/>
-          <w:sz w:val="22"/>
-          <w:szCs w:val="22"/>
-        </w:rPr>
-      </w:pPr>
-      <w:r>
-        <w:rPr>
-          <w:color w:val="EE0000"/>
-          <w:sz w:val="22"/>
-          <w:szCs w:val="22"/>
-        </w:rPr>
-        <w:t xml:space="preserve">DROP </w:t>
-      </w:r>
-      <w:r>
-        <w:rPr>
-          <w:color w:val="EE0000"/>
-          <w:sz w:val="22"/>
-          <w:szCs w:val="22"/>
-        </w:rPr>
-        <w:t xml:space="preserve">TABLE </w:t>
-      </w:r>
-      <w:r>
-        <w:rPr>
-          <w:color w:val="EE0000"/>
-          <w:sz w:val="22"/>
-          <w:szCs w:val="22"/>
-        </w:rPr>
-        <w:t>name;</w:t>
-      </w:r>
-      <w:r>
-        <w:rPr>
-          <w:color w:val="000000" w:themeColor="text1"/>
-          <w:sz w:val="22"/>
-          <w:szCs w:val="22"/>
-        </w:rPr>
         <w:t xml:space="preserve"> to delete a table</w:t>
       </w:r>
     </w:p>
@@ -1187,71 +1113,66 @@
           <w:sz w:val="22"/>
           <w:szCs w:val="22"/>
         </w:rPr>
-        <w:t xml:space="preserve">ALTER TABLE </w:t>
-      </w:r>
-      <w:proofErr w:type="spellStart"/>
-      <w:r>
-        <w:rPr>
-          <w:color w:val="EE0000"/>
-          <w:sz w:val="22"/>
-          <w:szCs w:val="22"/>
-        </w:rPr>
-        <w:t>table_name</w:t>
-      </w:r>
-      <w:proofErr w:type="spellEnd"/>
-      <w:r>
-        <w:rPr>
-          <w:color w:val="EE0000"/>
-          <w:sz w:val="22"/>
-          <w:szCs w:val="22"/>
-        </w:rPr>
-        <w:t xml:space="preserve"> ADD </w:t>
-      </w:r>
-      <w:proofErr w:type="spellStart"/>
-      <w:r>
-        <w:rPr>
-          <w:color w:val="EE0000"/>
-          <w:sz w:val="22"/>
-          <w:szCs w:val="22"/>
-        </w:rPr>
-        <w:t>column_name</w:t>
-      </w:r>
-      <w:proofErr w:type="spellEnd"/>
-      <w:r>
-        <w:rPr>
-          <w:color w:val="EE0000"/>
-          <w:sz w:val="22"/>
-          <w:szCs w:val="22"/>
-        </w:rPr>
-        <w:t xml:space="preserve"> DATATYPE;</w:t>
-      </w:r>
-    </w:p>
-    <w:p>
-      <w:pPr>
-        <w:rPr>
-          <w:color w:val="EE0000"/>
-          <w:sz w:val="22"/>
-          <w:szCs w:val="22"/>
-        </w:rPr>
-      </w:pPr>
-      <w:r>
-        <w:rPr>
-          <w:color w:val="EE0000"/>
-          <w:sz w:val="22"/>
-          <w:szCs w:val="22"/>
-        </w:rPr>
-        <w:t xml:space="preserve">ALTER TABLE </w:t>
-      </w:r>
-      <w:proofErr w:type="spellStart"/>
-      <w:r>
-        <w:rPr>
-          <w:color w:val="EE0000"/>
-          <w:sz w:val="22"/>
-          <w:szCs w:val="22"/>
-        </w:rPr>
-        <w:t>table_name</w:t>
-      </w:r>
-      <w:proofErr w:type="spellEnd"/>
+        <w:t>ALTER TABLE table_name ADD column_name DATATYPE;</w:t>
+      </w:r>
+    </w:p>
+    <w:p>
+      <w:pPr>
+        <w:rPr>
+          <w:color w:val="EE0000"/>
+          <w:sz w:val="22"/>
+          <w:szCs w:val="22"/>
+        </w:rPr>
+      </w:pPr>
+      <w:r>
+        <w:rPr>
+          <w:color w:val="EE0000"/>
+          <w:sz w:val="22"/>
+          <w:szCs w:val="22"/>
+        </w:rPr>
+        <w:t xml:space="preserve">ALTER TABLE table_name </w:t>
+      </w:r>
+      <w:r>
+        <w:rPr>
+          <w:color w:val="EE0000"/>
+          <w:sz w:val="22"/>
+          <w:szCs w:val="22"/>
+        </w:rPr>
+        <w:t>DROP COLUMN</w:t>
+      </w:r>
+      <w:r>
+        <w:rPr>
+          <w:color w:val="EE0000"/>
+          <w:sz w:val="22"/>
+          <w:szCs w:val="22"/>
+        </w:rPr>
+        <w:t xml:space="preserve"> column_name;</w:t>
+      </w:r>
+    </w:p>
+    <w:p>
+      <w:pPr>
+        <w:rPr>
+          <w:color w:val="000000" w:themeColor="text1"/>
+          <w:sz w:val="22"/>
+          <w:szCs w:val="22"/>
+        </w:rPr>
+      </w:pPr>
+      <w:r>
+        <w:rPr>
+          <w:color w:val="EE0000"/>
+          <w:sz w:val="22"/>
+          <w:szCs w:val="22"/>
+        </w:rPr>
+        <w:t xml:space="preserve">INSERET INTO table_name VALUES (); </w:t>
+      </w:r>
+      <w:r>
+        <w:rPr>
+          <w:color w:val="EE0000"/>
+          <w:sz w:val="22"/>
+          <w:szCs w:val="22"/>
+        </w:rPr>
+        <w:sym w:font="Wingdings" w:char="F0E0"/>
+      </w:r>
       <w:r>
         <w:rPr>
           <w:color w:val="EE0000"/>
@@ -1262,91 +1183,6 @@
       </w:r>
       <w:r>
         <w:rPr>
-          <w:color w:val="EE0000"/>
-          <w:sz w:val="22"/>
-          <w:szCs w:val="22"/>
-        </w:rPr>
-        <w:t>DROP COLUMN</w:t>
-      </w:r>
-      <w:r>
-        <w:rPr>
-          <w:color w:val="EE0000"/>
-          <w:sz w:val="22"/>
-          <w:szCs w:val="22"/>
-        </w:rPr>
-        <w:t xml:space="preserve"> </w:t>
-      </w:r>
-      <w:proofErr w:type="spellStart"/>
-      <w:r>
-        <w:rPr>
-          <w:color w:val="EE0000"/>
-          <w:sz w:val="22"/>
-          <w:szCs w:val="22"/>
-        </w:rPr>
-        <w:t>column_name</w:t>
-      </w:r>
-      <w:proofErr w:type="spellEnd"/>
-      <w:r>
-        <w:rPr>
-          <w:color w:val="EE0000"/>
-          <w:sz w:val="22"/>
-          <w:szCs w:val="22"/>
-        </w:rPr>
-        <w:t>;</w:t>
-      </w:r>
-    </w:p>
-    <w:p>
-      <w:pPr>
-        <w:rPr>
-          <w:color w:val="000000" w:themeColor="text1"/>
-          <w:sz w:val="22"/>
-          <w:szCs w:val="22"/>
-        </w:rPr>
-      </w:pPr>
-      <w:r>
-        <w:rPr>
-          <w:color w:val="EE0000"/>
-          <w:sz w:val="22"/>
-          <w:szCs w:val="22"/>
-        </w:rPr>
-        <w:t xml:space="preserve">INSERET INTO </w:t>
-      </w:r>
-      <w:proofErr w:type="spellStart"/>
-      <w:r>
-        <w:rPr>
-          <w:color w:val="EE0000"/>
-          <w:sz w:val="22"/>
-          <w:szCs w:val="22"/>
-        </w:rPr>
-        <w:t>table_name</w:t>
-      </w:r>
-      <w:proofErr w:type="spellEnd"/>
-      <w:r>
-        <w:rPr>
-          <w:color w:val="EE0000"/>
-          <w:sz w:val="22"/>
-          <w:szCs w:val="22"/>
-        </w:rPr>
-        <w:t xml:space="preserve"> VALUES (); </w:t>
-      </w:r>
-      <w:r>
-        <w:rPr>
-          <w:color w:val="EE0000"/>
-          <w:sz w:val="22"/>
-          <w:szCs w:val="22"/>
-        </w:rPr>
-        <w:sym w:font="Wingdings" w:char="F0E0"/>
-      </w:r>
-      <w:r>
-        <w:rPr>
-          <w:color w:val="EE0000"/>
-          <w:sz w:val="22"/>
-          <w:szCs w:val="22"/>
-        </w:rPr>
-        <w:t xml:space="preserve"> </w:t>
-      </w:r>
-      <w:r>
-        <w:rPr>
           <w:color w:val="000000" w:themeColor="text1"/>
           <w:sz w:val="22"/>
           <w:szCs w:val="22"/>
@@ -1368,25 +1204,7 @@
           <w:sz w:val="22"/>
           <w:szCs w:val="22"/>
         </w:rPr>
-        <w:t xml:space="preserve">SELECT * FROM </w:t>
-      </w:r>
-      <w:proofErr w:type="spellStart"/>
-      <w:r>
-        <w:rPr>
-          <w:color w:val="EE0000"/>
-          <w:sz w:val="22"/>
-          <w:szCs w:val="22"/>
-        </w:rPr>
-        <w:t>table_name</w:t>
-      </w:r>
-      <w:proofErr w:type="spellEnd"/>
-      <w:r>
-        <w:rPr>
-          <w:color w:val="EE0000"/>
-          <w:sz w:val="22"/>
-          <w:szCs w:val="22"/>
-        </w:rPr>
-        <w:t>;</w:t>
+        <w:t>SELECT * FROM table_name;</w:t>
       </w:r>
       <w:r>
         <w:rPr>
@@ -1411,79 +1229,7 @@
           <w:sz w:val="22"/>
           <w:szCs w:val="22"/>
         </w:rPr>
-        <w:t xml:space="preserve">INSERT INTO </w:t>
-      </w:r>
-      <w:proofErr w:type="spellStart"/>
-      <w:r>
-        <w:rPr>
-          <w:color w:val="EE0000"/>
-          <w:sz w:val="22"/>
-          <w:szCs w:val="22"/>
-        </w:rPr>
-        <w:t>table_name</w:t>
-      </w:r>
-      <w:proofErr w:type="spellEnd"/>
-      <w:r>
-        <w:rPr>
-          <w:color w:val="EE0000"/>
-          <w:sz w:val="22"/>
-          <w:szCs w:val="22"/>
-        </w:rPr>
-        <w:t xml:space="preserve"> (</w:t>
-      </w:r>
-      <w:proofErr w:type="spellStart"/>
-      <w:r>
-        <w:rPr>
-          <w:color w:val="EE0000"/>
-          <w:sz w:val="22"/>
-          <w:szCs w:val="22"/>
-        </w:rPr>
-        <w:t>column_name</w:t>
-      </w:r>
-      <w:proofErr w:type="spellEnd"/>
-      <w:r>
-        <w:rPr>
-          <w:color w:val="EE0000"/>
-          <w:sz w:val="22"/>
-          <w:szCs w:val="22"/>
-        </w:rPr>
-        <w:t xml:space="preserve">, </w:t>
-      </w:r>
-      <w:proofErr w:type="spellStart"/>
-      <w:r>
-        <w:rPr>
-          <w:color w:val="EE0000"/>
-          <w:sz w:val="22"/>
-          <w:szCs w:val="22"/>
-        </w:rPr>
-        <w:t>column_name</w:t>
-      </w:r>
-      <w:proofErr w:type="spellEnd"/>
-      <w:r>
-        <w:rPr>
-          <w:color w:val="EE0000"/>
-          <w:sz w:val="22"/>
-          <w:szCs w:val="22"/>
-        </w:rPr>
-        <w:t xml:space="preserve">) </w:t>
-      </w:r>
-      <w:proofErr w:type="gramStart"/>
-      <w:r>
-        <w:rPr>
-          <w:color w:val="EE0000"/>
-          <w:sz w:val="22"/>
-          <w:szCs w:val="22"/>
-        </w:rPr>
-        <w:t>VALUES(</w:t>
-      </w:r>
-      <w:proofErr w:type="gramEnd"/>
-      <w:r>
-        <w:rPr>
-          <w:color w:val="EE0000"/>
-          <w:sz w:val="22"/>
-          <w:szCs w:val="22"/>
-        </w:rPr>
-        <w:t xml:space="preserve">); </w:t>
+        <w:t xml:space="preserve">INSERT INTO table_name (column_name, column_name) VALUES(); </w:t>
       </w:r>
       <w:r>
         <w:rPr>
@@ -1648,7 +1394,6 @@
           <w:szCs w:val="22"/>
         </w:rPr>
       </w:pPr>
-      <w:proofErr w:type="spellStart"/>
       <w:r>
         <w:rPr>
           <w:color w:val="000000" w:themeColor="text1"/>
@@ -1657,7 +1402,6 @@
         </w:rPr>
         <w:t>Auto_increment</w:t>
       </w:r>
-      <w:proofErr w:type="spellEnd"/>
     </w:p>
     <w:p>
       <w:pPr>
@@ -1690,18 +1434,8 @@
           <w:sz w:val="22"/>
           <w:szCs w:val="22"/>
         </w:rPr>
-        <w:t>CREATE TABLE TABLE_</w:t>
-      </w:r>
-      <w:proofErr w:type="gramStart"/>
-      <w:r>
-        <w:rPr>
-          <w:color w:val="EE0000"/>
-          <w:sz w:val="22"/>
-          <w:szCs w:val="22"/>
-        </w:rPr>
-        <w:t>NAME(</w:t>
-      </w:r>
-      <w:proofErr w:type="gramEnd"/>
+        <w:t>CREATE TABLE TABLE_NAME(</w:t>
+      </w:r>
     </w:p>
     <w:p>
       <w:pPr>
@@ -1744,25 +1478,7 @@
           <w:szCs w:val="22"/>
         </w:rPr>
         <w:tab/>
-        <w:t xml:space="preserve">COLUMN_NAME </w:t>
-      </w:r>
-      <w:proofErr w:type="gramStart"/>
-      <w:r>
-        <w:rPr>
-          <w:color w:val="EE0000"/>
-          <w:sz w:val="22"/>
-          <w:szCs w:val="22"/>
-        </w:rPr>
-        <w:t>VARCHAR(</w:t>
-      </w:r>
-      <w:proofErr w:type="gramEnd"/>
-      <w:r>
-        <w:rPr>
-          <w:color w:val="EE0000"/>
-          <w:sz w:val="22"/>
-          <w:szCs w:val="22"/>
-        </w:rPr>
-        <w:t>20) UNIQUE</w:t>
+        <w:t>COLUMN_NAME VARCHAR(20) UNIQUE</w:t>
       </w:r>
     </w:p>
     <w:p>
@@ -1855,60 +1571,24 @@
           <w:sz w:val="22"/>
           <w:szCs w:val="22"/>
         </w:rPr>
-        <w:t xml:space="preserve">SET </w:t>
-      </w:r>
-      <w:proofErr w:type="spellStart"/>
-      <w:r>
-        <w:rPr>
-          <w:color w:val="EE0000"/>
-          <w:sz w:val="22"/>
-          <w:szCs w:val="22"/>
-        </w:rPr>
-        <w:t>column_name</w:t>
-      </w:r>
-      <w:proofErr w:type="spellEnd"/>
-      <w:r>
-        <w:rPr>
-          <w:color w:val="EE0000"/>
-          <w:sz w:val="22"/>
-          <w:szCs w:val="22"/>
-        </w:rPr>
-        <w:t xml:space="preserve"> = ‘value’</w:t>
-      </w:r>
-    </w:p>
-    <w:p>
-      <w:pPr>
-        <w:rPr>
-          <w:color w:val="EE0000"/>
-          <w:sz w:val="22"/>
-          <w:szCs w:val="22"/>
-        </w:rPr>
-      </w:pPr>
-      <w:r>
-        <w:rPr>
-          <w:color w:val="EE0000"/>
-          <w:sz w:val="22"/>
-          <w:szCs w:val="22"/>
-        </w:rPr>
-        <w:t xml:space="preserve">Where </w:t>
-      </w:r>
-      <w:proofErr w:type="spellStart"/>
-      <w:r>
-        <w:rPr>
-          <w:color w:val="EE0000"/>
-          <w:sz w:val="22"/>
-          <w:szCs w:val="22"/>
-        </w:rPr>
-        <w:t>row_name</w:t>
-      </w:r>
-      <w:proofErr w:type="spellEnd"/>
-      <w:r>
-        <w:rPr>
-          <w:color w:val="EE0000"/>
-          <w:sz w:val="22"/>
-          <w:szCs w:val="22"/>
-        </w:rPr>
-        <w:t xml:space="preserve"> = ‘value’; </w:t>
+        <w:t>SET column_name = ‘value’</w:t>
+      </w:r>
+    </w:p>
+    <w:p>
+      <w:pPr>
+        <w:rPr>
+          <w:color w:val="EE0000"/>
+          <w:sz w:val="22"/>
+          <w:szCs w:val="22"/>
+        </w:rPr>
+      </w:pPr>
+      <w:r>
+        <w:rPr>
+          <w:color w:val="EE0000"/>
+          <w:sz w:val="22"/>
+          <w:szCs w:val="22"/>
+        </w:rPr>
+        <w:t xml:space="preserve">Where row_name = ‘value’; </w:t>
       </w:r>
     </w:p>
     <w:p>
@@ -2104,25 +1784,7 @@
           <w:sz w:val="22"/>
           <w:szCs w:val="22"/>
         </w:rPr>
-        <w:t>SELECT COLUMN_NAME1, COLUMN_NAME2 FROM TABLE_</w:t>
-      </w:r>
-      <w:proofErr w:type="gramStart"/>
-      <w:r>
-        <w:rPr>
-          <w:color w:val="EE0000"/>
-          <w:sz w:val="22"/>
-          <w:szCs w:val="22"/>
-        </w:rPr>
-        <w:t>NAME ;</w:t>
-      </w:r>
-      <w:proofErr w:type="gramEnd"/>
-      <w:r>
-        <w:rPr>
-          <w:color w:val="EE0000"/>
-          <w:sz w:val="22"/>
-          <w:szCs w:val="22"/>
-        </w:rPr>
-        <w:t xml:space="preserve"> </w:t>
+        <w:t xml:space="preserve">SELECT COLUMN_NAME1, COLUMN_NAME2 FROM TABLE_NAME ; </w:t>
       </w:r>
     </w:p>
     <w:p>
@@ -2292,60 +1954,24 @@
           <w:sz w:val="22"/>
           <w:szCs w:val="22"/>
         </w:rPr>
-        <w:t>ADD FOREIGN KEY (</w:t>
-      </w:r>
-      <w:proofErr w:type="spellStart"/>
-      <w:r>
-        <w:rPr>
-          <w:color w:val="EE0000"/>
-          <w:sz w:val="22"/>
-          <w:szCs w:val="22"/>
-        </w:rPr>
-        <w:t>branch_id</w:t>
-      </w:r>
-      <w:proofErr w:type="spellEnd"/>
-      <w:r>
-        <w:rPr>
-          <w:color w:val="EE0000"/>
-          <w:sz w:val="22"/>
-          <w:szCs w:val="22"/>
-        </w:rPr>
-        <w:t>)</w:t>
-      </w:r>
-    </w:p>
-    <w:p>
-      <w:pPr>
-        <w:rPr>
-          <w:color w:val="EE0000"/>
-          <w:sz w:val="22"/>
-          <w:szCs w:val="22"/>
-        </w:rPr>
-      </w:pPr>
-      <w:r>
-        <w:rPr>
-          <w:color w:val="EE0000"/>
-          <w:sz w:val="22"/>
-          <w:szCs w:val="22"/>
-        </w:rPr>
-        <w:t>REFERENCES branch(</w:t>
-      </w:r>
-      <w:proofErr w:type="spellStart"/>
-      <w:r>
-        <w:rPr>
-          <w:color w:val="EE0000"/>
-          <w:sz w:val="22"/>
-          <w:szCs w:val="22"/>
-        </w:rPr>
-        <w:t>branch_id</w:t>
-      </w:r>
-      <w:proofErr w:type="spellEnd"/>
-      <w:r>
-        <w:rPr>
-          <w:color w:val="EE0000"/>
-          <w:sz w:val="22"/>
-          <w:szCs w:val="22"/>
-        </w:rPr>
-        <w:t>)</w:t>
+        <w:t>ADD FOREIGN KEY (branch_id)</w:t>
+      </w:r>
+    </w:p>
+    <w:p>
+      <w:pPr>
+        <w:rPr>
+          <w:color w:val="EE0000"/>
+          <w:sz w:val="22"/>
+          <w:szCs w:val="22"/>
+        </w:rPr>
+      </w:pPr>
+      <w:r>
+        <w:rPr>
+          <w:color w:val="EE0000"/>
+          <w:sz w:val="22"/>
+          <w:szCs w:val="22"/>
+        </w:rPr>
+        <w:t>REFERENCES branch(branch_id)</w:t>
       </w:r>
     </w:p>
     <w:p>
@@ -2388,228 +2014,92 @@
           <w:sz w:val="22"/>
           <w:szCs w:val="22"/>
         </w:rPr>
-        <w:t xml:space="preserve">CREATE TABLE </w:t>
-      </w:r>
-      <w:proofErr w:type="gramStart"/>
-      <w:r>
-        <w:rPr>
-          <w:color w:val="EE0000"/>
-          <w:sz w:val="22"/>
-          <w:szCs w:val="22"/>
-        </w:rPr>
-        <w:t>employee(</w:t>
-      </w:r>
-      <w:proofErr w:type="gramEnd"/>
-    </w:p>
-    <w:p>
-      <w:pPr>
-        <w:rPr>
-          <w:color w:val="EE0000"/>
-          <w:sz w:val="22"/>
-          <w:szCs w:val="22"/>
-        </w:rPr>
-      </w:pPr>
-      <w:r>
-        <w:rPr>
-          <w:color w:val="EE0000"/>
-          <w:sz w:val="22"/>
-          <w:szCs w:val="22"/>
-        </w:rPr>
-        <w:t xml:space="preserve">    </w:t>
-      </w:r>
-      <w:proofErr w:type="spellStart"/>
-      <w:r>
-        <w:rPr>
-          <w:color w:val="EE0000"/>
-          <w:sz w:val="22"/>
-          <w:szCs w:val="22"/>
-        </w:rPr>
-        <w:t>emp_id</w:t>
-      </w:r>
-      <w:proofErr w:type="spellEnd"/>
-      <w:r>
-        <w:rPr>
-          <w:color w:val="EE0000"/>
-          <w:sz w:val="22"/>
-          <w:szCs w:val="22"/>
-        </w:rPr>
-        <w:t xml:space="preserve"> INT PRIMARY KEY,</w:t>
-      </w:r>
-    </w:p>
-    <w:p>
-      <w:pPr>
-        <w:rPr>
-          <w:color w:val="EE0000"/>
-          <w:sz w:val="22"/>
-          <w:szCs w:val="22"/>
-        </w:rPr>
-      </w:pPr>
-      <w:r>
-        <w:rPr>
-          <w:color w:val="EE0000"/>
-          <w:sz w:val="22"/>
-          <w:szCs w:val="22"/>
-        </w:rPr>
-        <w:t xml:space="preserve">    </w:t>
-      </w:r>
-      <w:proofErr w:type="spellStart"/>
-      <w:r>
-        <w:rPr>
-          <w:color w:val="EE0000"/>
-          <w:sz w:val="22"/>
-          <w:szCs w:val="22"/>
-        </w:rPr>
-        <w:t>first_name</w:t>
-      </w:r>
-      <w:proofErr w:type="spellEnd"/>
-      <w:r>
-        <w:rPr>
-          <w:color w:val="EE0000"/>
-          <w:sz w:val="22"/>
-          <w:szCs w:val="22"/>
-        </w:rPr>
-        <w:t xml:space="preserve"> </w:t>
-      </w:r>
-      <w:proofErr w:type="gramStart"/>
-      <w:r>
-        <w:rPr>
-          <w:color w:val="EE0000"/>
-          <w:sz w:val="22"/>
-          <w:szCs w:val="22"/>
-        </w:rPr>
-        <w:t>VARCHAR(</w:t>
-      </w:r>
-      <w:proofErr w:type="gramEnd"/>
-      <w:r>
-        <w:rPr>
-          <w:color w:val="EE0000"/>
-          <w:sz w:val="22"/>
-          <w:szCs w:val="22"/>
-        </w:rPr>
-        <w:t>20),</w:t>
-      </w:r>
-    </w:p>
-    <w:p>
-      <w:pPr>
-        <w:rPr>
-          <w:color w:val="EE0000"/>
-          <w:sz w:val="22"/>
-          <w:szCs w:val="22"/>
-        </w:rPr>
-      </w:pPr>
-      <w:r>
-        <w:rPr>
-          <w:color w:val="EE0000"/>
-          <w:sz w:val="22"/>
-          <w:szCs w:val="22"/>
-        </w:rPr>
-        <w:t xml:space="preserve">    </w:t>
-      </w:r>
-      <w:proofErr w:type="spellStart"/>
-      <w:r>
-        <w:rPr>
-          <w:color w:val="EE0000"/>
-          <w:sz w:val="22"/>
-          <w:szCs w:val="22"/>
-        </w:rPr>
-        <w:t>last_name</w:t>
-      </w:r>
-      <w:proofErr w:type="spellEnd"/>
-      <w:r>
-        <w:rPr>
-          <w:color w:val="EE0000"/>
-          <w:sz w:val="22"/>
-          <w:szCs w:val="22"/>
-        </w:rPr>
-        <w:t xml:space="preserve"> </w:t>
-      </w:r>
-      <w:proofErr w:type="gramStart"/>
-      <w:r>
-        <w:rPr>
-          <w:color w:val="EE0000"/>
-          <w:sz w:val="22"/>
-          <w:szCs w:val="22"/>
-        </w:rPr>
-        <w:t>VARCHAR(</w:t>
-      </w:r>
-      <w:proofErr w:type="gramEnd"/>
-      <w:r>
-        <w:rPr>
-          <w:color w:val="EE0000"/>
-          <w:sz w:val="22"/>
-          <w:szCs w:val="22"/>
-        </w:rPr>
-        <w:t>20),</w:t>
-      </w:r>
-    </w:p>
-    <w:p>
-      <w:pPr>
-        <w:rPr>
-          <w:color w:val="EE0000"/>
-          <w:sz w:val="22"/>
-          <w:szCs w:val="22"/>
-        </w:rPr>
-      </w:pPr>
-      <w:r>
-        <w:rPr>
-          <w:color w:val="EE0000"/>
-          <w:sz w:val="22"/>
-          <w:szCs w:val="22"/>
-        </w:rPr>
-        <w:t xml:space="preserve">    </w:t>
-      </w:r>
-      <w:proofErr w:type="spellStart"/>
-      <w:r>
-        <w:rPr>
-          <w:color w:val="EE0000"/>
-          <w:sz w:val="22"/>
-          <w:szCs w:val="22"/>
-        </w:rPr>
-        <w:t>birth_date</w:t>
-      </w:r>
-      <w:proofErr w:type="spellEnd"/>
-      <w:r>
-        <w:rPr>
-          <w:color w:val="EE0000"/>
-          <w:sz w:val="22"/>
-          <w:szCs w:val="22"/>
-        </w:rPr>
-        <w:t xml:space="preserve"> DATE,</w:t>
-      </w:r>
-    </w:p>
-    <w:p>
-      <w:pPr>
-        <w:rPr>
-          <w:color w:val="EE0000"/>
-          <w:sz w:val="22"/>
-          <w:szCs w:val="22"/>
-        </w:rPr>
-      </w:pPr>
-      <w:r>
-        <w:rPr>
-          <w:color w:val="EE0000"/>
-          <w:sz w:val="22"/>
-          <w:szCs w:val="22"/>
-        </w:rPr>
-        <w:t xml:space="preserve">    sex </w:t>
-      </w:r>
-      <w:proofErr w:type="gramStart"/>
-      <w:r>
-        <w:rPr>
-          <w:color w:val="EE0000"/>
-          <w:sz w:val="22"/>
-          <w:szCs w:val="22"/>
-        </w:rPr>
-        <w:t>VARCHAR(</w:t>
-      </w:r>
-      <w:proofErr w:type="gramEnd"/>
-      <w:r>
-        <w:rPr>
-          <w:color w:val="EE0000"/>
-          <w:sz w:val="22"/>
-          <w:szCs w:val="22"/>
-        </w:rPr>
-        <w:t>1),</w:t>
+        <w:t>CREATE TABLE employee(</w:t>
+      </w:r>
+    </w:p>
+    <w:p>
+      <w:pPr>
+        <w:rPr>
+          <w:color w:val="EE0000"/>
+          <w:sz w:val="22"/>
+          <w:szCs w:val="22"/>
+        </w:rPr>
+      </w:pPr>
+      <w:r>
+        <w:rPr>
+          <w:color w:val="EE0000"/>
+          <w:sz w:val="22"/>
+          <w:szCs w:val="22"/>
+        </w:rPr>
+        <w:t>    emp_id INT PRIMARY KEY,</w:t>
+      </w:r>
+    </w:p>
+    <w:p>
+      <w:pPr>
+        <w:rPr>
+          <w:color w:val="EE0000"/>
+          <w:sz w:val="22"/>
+          <w:szCs w:val="22"/>
+        </w:rPr>
+      </w:pPr>
+      <w:r>
+        <w:rPr>
+          <w:color w:val="EE0000"/>
+          <w:sz w:val="22"/>
+          <w:szCs w:val="22"/>
+        </w:rPr>
+        <w:t>    first_name VARCHAR(20),</w:t>
+      </w:r>
+    </w:p>
+    <w:p>
+      <w:pPr>
+        <w:rPr>
+          <w:color w:val="EE0000"/>
+          <w:sz w:val="22"/>
+          <w:szCs w:val="22"/>
+        </w:rPr>
+      </w:pPr>
+      <w:r>
+        <w:rPr>
+          <w:color w:val="EE0000"/>
+          <w:sz w:val="22"/>
+          <w:szCs w:val="22"/>
+        </w:rPr>
+        <w:t>    last_name VARCHAR(20),</w:t>
+      </w:r>
+    </w:p>
+    <w:p>
+      <w:pPr>
+        <w:rPr>
+          <w:color w:val="EE0000"/>
+          <w:sz w:val="22"/>
+          <w:szCs w:val="22"/>
+        </w:rPr>
+      </w:pPr>
+      <w:r>
+        <w:rPr>
+          <w:color w:val="EE0000"/>
+          <w:sz w:val="22"/>
+          <w:szCs w:val="22"/>
+        </w:rPr>
+        <w:t>    birth_date DATE,</w:t>
+      </w:r>
+    </w:p>
+    <w:p>
+      <w:pPr>
+        <w:rPr>
+          <w:color w:val="EE0000"/>
+          <w:sz w:val="22"/>
+          <w:szCs w:val="22"/>
+        </w:rPr>
+      </w:pPr>
+      <w:r>
+        <w:rPr>
+          <w:color w:val="EE0000"/>
+          <w:sz w:val="22"/>
+          <w:szCs w:val="22"/>
+        </w:rPr>
+        <w:t>    sex VARCHAR(1),</w:t>
       </w:r>
     </w:p>
     <w:p>
@@ -2643,60 +2133,24 @@
           <w:sz w:val="22"/>
           <w:szCs w:val="22"/>
         </w:rPr>
-        <w:t xml:space="preserve">    </w:t>
-      </w:r>
-      <w:proofErr w:type="spellStart"/>
-      <w:r>
-        <w:rPr>
-          <w:color w:val="EE0000"/>
-          <w:sz w:val="22"/>
-          <w:szCs w:val="22"/>
-        </w:rPr>
-        <w:t>super_id</w:t>
-      </w:r>
-      <w:proofErr w:type="spellEnd"/>
-      <w:r>
-        <w:rPr>
-          <w:color w:val="EE0000"/>
-          <w:sz w:val="22"/>
-          <w:szCs w:val="22"/>
-        </w:rPr>
-        <w:t xml:space="preserve"> INT,</w:t>
-      </w:r>
-    </w:p>
-    <w:p>
-      <w:pPr>
-        <w:rPr>
-          <w:color w:val="EE0000"/>
-          <w:sz w:val="22"/>
-          <w:szCs w:val="22"/>
-        </w:rPr>
-      </w:pPr>
-      <w:r>
-        <w:rPr>
-          <w:color w:val="EE0000"/>
-          <w:sz w:val="22"/>
-          <w:szCs w:val="22"/>
-        </w:rPr>
-        <w:t xml:space="preserve">    </w:t>
-      </w:r>
-      <w:proofErr w:type="spellStart"/>
-      <w:r>
-        <w:rPr>
-          <w:color w:val="EE0000"/>
-          <w:sz w:val="22"/>
-          <w:szCs w:val="22"/>
-        </w:rPr>
-        <w:t>branch_id</w:t>
-      </w:r>
-      <w:proofErr w:type="spellEnd"/>
-      <w:r>
-        <w:rPr>
-          <w:color w:val="EE0000"/>
-          <w:sz w:val="22"/>
-          <w:szCs w:val="22"/>
-        </w:rPr>
-        <w:t xml:space="preserve"> INT</w:t>
+        <w:t>    super_id INT,</w:t>
+      </w:r>
+    </w:p>
+    <w:p>
+      <w:pPr>
+        <w:rPr>
+          <w:color w:val="EE0000"/>
+          <w:sz w:val="22"/>
+          <w:szCs w:val="22"/>
+        </w:rPr>
+      </w:pPr>
+      <w:r>
+        <w:rPr>
+          <w:color w:val="EE0000"/>
+          <w:sz w:val="22"/>
+          <w:szCs w:val="22"/>
+        </w:rPr>
+        <w:t>    branch_id INT</w:t>
       </w:r>
     </w:p>
     <w:p>
@@ -2740,228 +2194,92 @@
           <w:sz w:val="22"/>
           <w:szCs w:val="22"/>
         </w:rPr>
-        <w:t xml:space="preserve">CREATE TABLE </w:t>
-      </w:r>
-      <w:proofErr w:type="gramStart"/>
-      <w:r>
-        <w:rPr>
-          <w:color w:val="EE0000"/>
-          <w:sz w:val="22"/>
-          <w:szCs w:val="22"/>
-        </w:rPr>
-        <w:t>branch(</w:t>
-      </w:r>
-      <w:proofErr w:type="gramEnd"/>
-    </w:p>
-    <w:p>
-      <w:pPr>
-        <w:rPr>
-          <w:color w:val="EE0000"/>
-          <w:sz w:val="22"/>
-          <w:szCs w:val="22"/>
-        </w:rPr>
-      </w:pPr>
-      <w:r>
-        <w:rPr>
-          <w:color w:val="EE0000"/>
-          <w:sz w:val="22"/>
-          <w:szCs w:val="22"/>
-        </w:rPr>
-        <w:t xml:space="preserve">    </w:t>
-      </w:r>
-      <w:proofErr w:type="spellStart"/>
-      <w:r>
-        <w:rPr>
-          <w:color w:val="EE0000"/>
-          <w:sz w:val="22"/>
-          <w:szCs w:val="22"/>
-        </w:rPr>
-        <w:t>branch_id</w:t>
-      </w:r>
-      <w:proofErr w:type="spellEnd"/>
-      <w:r>
-        <w:rPr>
-          <w:color w:val="EE0000"/>
-          <w:sz w:val="22"/>
-          <w:szCs w:val="22"/>
-        </w:rPr>
-        <w:t xml:space="preserve"> INT PRIMARY KEY,</w:t>
-      </w:r>
-    </w:p>
-    <w:p>
-      <w:pPr>
-        <w:rPr>
-          <w:color w:val="EE0000"/>
-          <w:sz w:val="22"/>
-          <w:szCs w:val="22"/>
-        </w:rPr>
-      </w:pPr>
-      <w:r>
-        <w:rPr>
-          <w:color w:val="EE0000"/>
-          <w:sz w:val="22"/>
-          <w:szCs w:val="22"/>
-        </w:rPr>
-        <w:t xml:space="preserve">    </w:t>
-      </w:r>
-      <w:proofErr w:type="spellStart"/>
-      <w:r>
-        <w:rPr>
-          <w:color w:val="EE0000"/>
-          <w:sz w:val="22"/>
-          <w:szCs w:val="22"/>
-        </w:rPr>
-        <w:t>branch_name</w:t>
-      </w:r>
-      <w:proofErr w:type="spellEnd"/>
-      <w:r>
-        <w:rPr>
-          <w:color w:val="EE0000"/>
-          <w:sz w:val="22"/>
-          <w:szCs w:val="22"/>
-        </w:rPr>
-        <w:t xml:space="preserve"> </w:t>
-      </w:r>
-      <w:proofErr w:type="gramStart"/>
-      <w:r>
-        <w:rPr>
-          <w:color w:val="EE0000"/>
-          <w:sz w:val="22"/>
-          <w:szCs w:val="22"/>
-        </w:rPr>
-        <w:t>VARCHAR(</w:t>
-      </w:r>
-      <w:proofErr w:type="gramEnd"/>
-      <w:r>
-        <w:rPr>
-          <w:color w:val="EE0000"/>
-          <w:sz w:val="22"/>
-          <w:szCs w:val="22"/>
-        </w:rPr>
-        <w:t>20),</w:t>
-      </w:r>
-    </w:p>
-    <w:p>
-      <w:pPr>
-        <w:rPr>
-          <w:color w:val="EE0000"/>
-          <w:sz w:val="22"/>
-          <w:szCs w:val="22"/>
-        </w:rPr>
-      </w:pPr>
-      <w:r>
-        <w:rPr>
-          <w:color w:val="EE0000"/>
-          <w:sz w:val="22"/>
-          <w:szCs w:val="22"/>
-        </w:rPr>
-        <w:t xml:space="preserve">    </w:t>
-      </w:r>
-      <w:proofErr w:type="spellStart"/>
-      <w:r>
-        <w:rPr>
-          <w:color w:val="EE0000"/>
-          <w:sz w:val="22"/>
-          <w:szCs w:val="22"/>
-        </w:rPr>
-        <w:t>manager_id</w:t>
-      </w:r>
-      <w:proofErr w:type="spellEnd"/>
-      <w:r>
-        <w:rPr>
-          <w:color w:val="EE0000"/>
-          <w:sz w:val="22"/>
-          <w:szCs w:val="22"/>
-        </w:rPr>
-        <w:t xml:space="preserve"> INT,</w:t>
-      </w:r>
-    </w:p>
-    <w:p>
-      <w:pPr>
-        <w:rPr>
-          <w:color w:val="EE0000"/>
-          <w:sz w:val="22"/>
-          <w:szCs w:val="22"/>
-        </w:rPr>
-      </w:pPr>
-      <w:r>
-        <w:rPr>
-          <w:color w:val="EE0000"/>
-          <w:sz w:val="22"/>
-          <w:szCs w:val="22"/>
-        </w:rPr>
-        <w:t>    FOREIGN KEY (</w:t>
-      </w:r>
-      <w:proofErr w:type="spellStart"/>
-      <w:r>
-        <w:rPr>
-          <w:color w:val="EE0000"/>
-          <w:sz w:val="22"/>
-          <w:szCs w:val="22"/>
-        </w:rPr>
-        <w:t>manager_id</w:t>
-      </w:r>
-      <w:proofErr w:type="spellEnd"/>
-      <w:r>
-        <w:rPr>
-          <w:color w:val="EE0000"/>
-          <w:sz w:val="22"/>
-          <w:szCs w:val="22"/>
-        </w:rPr>
-        <w:t>) REFERENCES employee (</w:t>
-      </w:r>
-      <w:proofErr w:type="spellStart"/>
-      <w:r>
-        <w:rPr>
-          <w:color w:val="EE0000"/>
-          <w:sz w:val="22"/>
-          <w:szCs w:val="22"/>
-        </w:rPr>
-        <w:t>emp_id</w:t>
-      </w:r>
-      <w:proofErr w:type="spellEnd"/>
-      <w:r>
-        <w:rPr>
-          <w:color w:val="EE0000"/>
-          <w:sz w:val="22"/>
-          <w:szCs w:val="22"/>
-        </w:rPr>
-        <w:t>) ON DELETE SET NULL,</w:t>
-      </w:r>
-    </w:p>
-    <w:p>
-      <w:pPr>
-        <w:rPr>
-          <w:color w:val="EE0000"/>
-          <w:sz w:val="22"/>
-          <w:szCs w:val="22"/>
-        </w:rPr>
-      </w:pPr>
-      <w:r>
-        <w:rPr>
-          <w:color w:val="EE0000"/>
-          <w:sz w:val="22"/>
-          <w:szCs w:val="22"/>
-        </w:rPr>
-        <w:t xml:space="preserve">    </w:t>
-      </w:r>
-      <w:proofErr w:type="spellStart"/>
-      <w:r>
-        <w:rPr>
-          <w:color w:val="EE0000"/>
-          <w:sz w:val="22"/>
-          <w:szCs w:val="22"/>
-        </w:rPr>
-        <w:t>manager_start_date</w:t>
-      </w:r>
-      <w:proofErr w:type="spellEnd"/>
-      <w:r>
-        <w:rPr>
-          <w:color w:val="EE0000"/>
-          <w:sz w:val="22"/>
-          <w:szCs w:val="22"/>
-        </w:rPr>
-        <w:t xml:space="preserve"> DATE </w:t>
+        <w:t>CREATE TABLE branch(</w:t>
+      </w:r>
+    </w:p>
+    <w:p>
+      <w:pPr>
+        <w:rPr>
+          <w:color w:val="EE0000"/>
+          <w:sz w:val="22"/>
+          <w:szCs w:val="22"/>
+        </w:rPr>
+      </w:pPr>
+      <w:r>
+        <w:rPr>
+          <w:color w:val="EE0000"/>
+          <w:sz w:val="22"/>
+          <w:szCs w:val="22"/>
+        </w:rPr>
+        <w:t>    branch_id INT PRIMARY KEY,</w:t>
+      </w:r>
+    </w:p>
+    <w:p>
+      <w:pPr>
+        <w:rPr>
+          <w:color w:val="EE0000"/>
+          <w:sz w:val="22"/>
+          <w:szCs w:val="22"/>
+        </w:rPr>
+      </w:pPr>
+      <w:r>
+        <w:rPr>
+          <w:color w:val="EE0000"/>
+          <w:sz w:val="22"/>
+          <w:szCs w:val="22"/>
+        </w:rPr>
+        <w:t>    branch_name VARCHAR(20),</w:t>
+      </w:r>
+    </w:p>
+    <w:p>
+      <w:pPr>
+        <w:rPr>
+          <w:color w:val="EE0000"/>
+          <w:sz w:val="22"/>
+          <w:szCs w:val="22"/>
+        </w:rPr>
+      </w:pPr>
+      <w:r>
+        <w:rPr>
+          <w:color w:val="EE0000"/>
+          <w:sz w:val="22"/>
+          <w:szCs w:val="22"/>
+        </w:rPr>
+        <w:t>    manager_id INT,</w:t>
+      </w:r>
+    </w:p>
+    <w:p>
+      <w:pPr>
+        <w:rPr>
+          <w:color w:val="EE0000"/>
+          <w:sz w:val="22"/>
+          <w:szCs w:val="22"/>
+        </w:rPr>
+      </w:pPr>
+      <w:r>
+        <w:rPr>
+          <w:color w:val="EE0000"/>
+          <w:sz w:val="22"/>
+          <w:szCs w:val="22"/>
+        </w:rPr>
+        <w:t>    FOREIGN KEY (manager_id) REFERENCES employee (emp_id) ON DELETE SET NULL,</w:t>
+      </w:r>
+    </w:p>
+    <w:p>
+      <w:pPr>
+        <w:rPr>
+          <w:color w:val="EE0000"/>
+          <w:sz w:val="22"/>
+          <w:szCs w:val="22"/>
+        </w:rPr>
+      </w:pPr>
+      <w:r>
+        <w:rPr>
+          <w:color w:val="EE0000"/>
+          <w:sz w:val="22"/>
+          <w:szCs w:val="22"/>
+        </w:rPr>
+        <w:t xml:space="preserve">    manager_start_date DATE </w:t>
       </w:r>
     </w:p>
     <w:p>
@@ -3021,25 +2339,84 @@
           <w:sz w:val="22"/>
           <w:szCs w:val="22"/>
         </w:rPr>
-        <w:t>ADD FOREIGN KEY (</w:t>
-      </w:r>
-      <w:proofErr w:type="spellStart"/>
-      <w:r>
-        <w:rPr>
-          <w:color w:val="EE0000"/>
-          <w:sz w:val="22"/>
-          <w:szCs w:val="22"/>
-        </w:rPr>
-        <w:t>branch_id</w:t>
-      </w:r>
-      <w:proofErr w:type="spellEnd"/>
-      <w:r>
-        <w:rPr>
-          <w:color w:val="EE0000"/>
-          <w:sz w:val="22"/>
-          <w:szCs w:val="22"/>
-        </w:rPr>
-        <w:t>)</w:t>
+        <w:t>ADD FOREIGN KEY (branch_id)</w:t>
+      </w:r>
+    </w:p>
+    <w:p>
+      <w:pPr>
+        <w:rPr>
+          <w:color w:val="EE0000"/>
+          <w:sz w:val="22"/>
+          <w:szCs w:val="22"/>
+        </w:rPr>
+      </w:pPr>
+      <w:r>
+        <w:rPr>
+          <w:color w:val="EE0000"/>
+          <w:sz w:val="22"/>
+          <w:szCs w:val="22"/>
+        </w:rPr>
+        <w:t>REFERENCES branch(branch_id)</w:t>
+      </w:r>
+    </w:p>
+    <w:p>
+      <w:pPr>
+        <w:rPr>
+          <w:color w:val="EE0000"/>
+          <w:sz w:val="22"/>
+          <w:szCs w:val="22"/>
+        </w:rPr>
+      </w:pPr>
+      <w:r>
+        <w:rPr>
+          <w:color w:val="EE0000"/>
+          <w:sz w:val="22"/>
+          <w:szCs w:val="22"/>
+        </w:rPr>
+        <w:t>ON DELETE SET NULL;</w:t>
+      </w:r>
+    </w:p>
+    <w:p>
+      <w:pPr>
+        <w:rPr>
+          <w:color w:val="EE0000"/>
+          <w:sz w:val="22"/>
+          <w:szCs w:val="22"/>
+        </w:rPr>
+      </w:pPr>
+    </w:p>
+    <w:p>
+      <w:pPr>
+        <w:rPr>
+          <w:color w:val="EE0000"/>
+          <w:sz w:val="22"/>
+          <w:szCs w:val="22"/>
+        </w:rPr>
+      </w:pPr>
+      <w:r>
+        <w:rPr>
+          <w:color w:val="EE0000"/>
+          <w:sz w:val="22"/>
+          <w:szCs w:val="22"/>
+        </w:rPr>
+        <w:t>ALTER TABLE employee</w:t>
+      </w:r>
+    </w:p>
+    <w:p>
+      <w:pPr>
+        <w:rPr>
+          <w:color w:val="EE0000"/>
+          <w:sz w:val="22"/>
+          <w:szCs w:val="22"/>
+        </w:rPr>
+      </w:pPr>
+      <w:r>
+        <w:rPr>
+          <w:color w:val="EE0000"/>
+          <w:sz w:val="22"/>
+          <w:szCs w:val="22"/>
+        </w:rPr>
+        <w:t xml:space="preserve">ADD FOREIGN KEY (super_id) </w:t>
       </w:r>
     </w:p>
     <w:p>
@@ -3058,23 +2435,21 @@
         </w:rPr>
         <w:t>REFERENCES branch(</w:t>
       </w:r>
-      <w:proofErr w:type="spellStart"/>
-      <w:r>
-        <w:rPr>
-          <w:color w:val="EE0000"/>
-          <w:sz w:val="22"/>
-          <w:szCs w:val="22"/>
-        </w:rPr>
-        <w:t>branch_id</w:t>
-      </w:r>
-      <w:proofErr w:type="spellEnd"/>
-      <w:r>
-        <w:rPr>
-          <w:color w:val="EE0000"/>
-          <w:sz w:val="22"/>
-          <w:szCs w:val="22"/>
-        </w:rPr>
-        <w:t>)</w:t>
+      <w:r>
+        <w:rPr>
+          <w:color w:val="EE0000"/>
+          <w:sz w:val="22"/>
+          <w:szCs w:val="22"/>
+        </w:rPr>
+        <w:t>manager</w:t>
+      </w:r>
+      <w:r>
+        <w:rPr>
+          <w:color w:val="EE0000"/>
+          <w:sz w:val="22"/>
+          <w:szCs w:val="22"/>
+        </w:rPr>
+        <w:t xml:space="preserve">_id) </w:t>
       </w:r>
     </w:p>
     <w:p>
@@ -3117,127 +2492,6 @@
           <w:sz w:val="22"/>
           <w:szCs w:val="22"/>
         </w:rPr>
-        <w:t>ALTER TABLE employee</w:t>
-      </w:r>
-    </w:p>
-    <w:p>
-      <w:pPr>
-        <w:rPr>
-          <w:color w:val="EE0000"/>
-          <w:sz w:val="22"/>
-          <w:szCs w:val="22"/>
-        </w:rPr>
-      </w:pPr>
-      <w:r>
-        <w:rPr>
-          <w:color w:val="EE0000"/>
-          <w:sz w:val="22"/>
-          <w:szCs w:val="22"/>
-        </w:rPr>
-        <w:t>ADD FOREIGN KEY (</w:t>
-      </w:r>
-      <w:proofErr w:type="spellStart"/>
-      <w:r>
-        <w:rPr>
-          <w:color w:val="EE0000"/>
-          <w:sz w:val="22"/>
-          <w:szCs w:val="22"/>
-        </w:rPr>
-        <w:t>super_id</w:t>
-      </w:r>
-      <w:proofErr w:type="spellEnd"/>
-      <w:r>
-        <w:rPr>
-          <w:color w:val="EE0000"/>
-          <w:sz w:val="22"/>
-          <w:szCs w:val="22"/>
-        </w:rPr>
-        <w:t xml:space="preserve">) </w:t>
-      </w:r>
-    </w:p>
-    <w:p>
-      <w:pPr>
-        <w:rPr>
-          <w:color w:val="EE0000"/>
-          <w:sz w:val="22"/>
-          <w:szCs w:val="22"/>
-        </w:rPr>
-      </w:pPr>
-      <w:r>
-        <w:rPr>
-          <w:color w:val="EE0000"/>
-          <w:sz w:val="22"/>
-          <w:szCs w:val="22"/>
-        </w:rPr>
-        <w:t>REFERENCES branch(</w:t>
-      </w:r>
-      <w:proofErr w:type="spellStart"/>
-      <w:r>
-        <w:rPr>
-          <w:color w:val="EE0000"/>
-          <w:sz w:val="22"/>
-          <w:szCs w:val="22"/>
-        </w:rPr>
-        <w:t>manager</w:t>
-      </w:r>
-      <w:r>
-        <w:rPr>
-          <w:color w:val="EE0000"/>
-          <w:sz w:val="22"/>
-          <w:szCs w:val="22"/>
-        </w:rPr>
-        <w:t>_id</w:t>
-      </w:r>
-      <w:proofErr w:type="spellEnd"/>
-      <w:r>
-        <w:rPr>
-          <w:color w:val="EE0000"/>
-          <w:sz w:val="22"/>
-          <w:szCs w:val="22"/>
-        </w:rPr>
-        <w:t xml:space="preserve">) </w:t>
-      </w:r>
-    </w:p>
-    <w:p>
-      <w:pPr>
-        <w:rPr>
-          <w:color w:val="EE0000"/>
-          <w:sz w:val="22"/>
-          <w:szCs w:val="22"/>
-        </w:rPr>
-      </w:pPr>
-      <w:r>
-        <w:rPr>
-          <w:color w:val="EE0000"/>
-          <w:sz w:val="22"/>
-          <w:szCs w:val="22"/>
-        </w:rPr>
-        <w:t>ON DELETE SET NULL;</w:t>
-      </w:r>
-    </w:p>
-    <w:p>
-      <w:pPr>
-        <w:rPr>
-          <w:color w:val="EE0000"/>
-          <w:sz w:val="22"/>
-          <w:szCs w:val="22"/>
-        </w:rPr>
-      </w:pPr>
-    </w:p>
-    <w:p>
-      <w:pPr>
-        <w:rPr>
-          <w:color w:val="EE0000"/>
-          <w:sz w:val="22"/>
-          <w:szCs w:val="22"/>
-        </w:rPr>
-      </w:pPr>
-      <w:r>
-        <w:rPr>
-          <w:color w:val="EE0000"/>
-          <w:sz w:val="22"/>
-          <w:szCs w:val="22"/>
-        </w:rPr>
         <w:t>DESCRIBE employee;</w:t>
       </w:r>
     </w:p>
@@ -3281,140 +2535,58 @@
           <w:sz w:val="22"/>
           <w:szCs w:val="22"/>
         </w:rPr>
-        <w:t xml:space="preserve">CREATE TABLE </w:t>
-      </w:r>
-      <w:proofErr w:type="gramStart"/>
-      <w:r>
-        <w:rPr>
-          <w:color w:val="EE0000"/>
-          <w:sz w:val="22"/>
-          <w:szCs w:val="22"/>
-        </w:rPr>
-        <w:t>client(</w:t>
-      </w:r>
-      <w:proofErr w:type="gramEnd"/>
-    </w:p>
-    <w:p>
-      <w:pPr>
-        <w:rPr>
-          <w:color w:val="EE0000"/>
-          <w:sz w:val="22"/>
-          <w:szCs w:val="22"/>
-        </w:rPr>
-      </w:pPr>
-      <w:r>
-        <w:rPr>
-          <w:color w:val="EE0000"/>
-          <w:sz w:val="22"/>
-          <w:szCs w:val="22"/>
-        </w:rPr>
-        <w:t xml:space="preserve">    </w:t>
-      </w:r>
-      <w:proofErr w:type="spellStart"/>
-      <w:r>
-        <w:rPr>
-          <w:color w:val="EE0000"/>
-          <w:sz w:val="22"/>
-          <w:szCs w:val="22"/>
-        </w:rPr>
-        <w:t>client_id</w:t>
-      </w:r>
-      <w:proofErr w:type="spellEnd"/>
-      <w:r>
-        <w:rPr>
-          <w:color w:val="EE0000"/>
-          <w:sz w:val="22"/>
-          <w:szCs w:val="22"/>
-        </w:rPr>
-        <w:t xml:space="preserve"> INT PRIMARY KEY,</w:t>
-      </w:r>
-    </w:p>
-    <w:p>
-      <w:pPr>
-        <w:rPr>
-          <w:color w:val="EE0000"/>
-          <w:sz w:val="22"/>
-          <w:szCs w:val="22"/>
-        </w:rPr>
-      </w:pPr>
-      <w:r>
-        <w:rPr>
-          <w:color w:val="EE0000"/>
-          <w:sz w:val="22"/>
-          <w:szCs w:val="22"/>
-        </w:rPr>
-        <w:t xml:space="preserve">    </w:t>
-      </w:r>
-      <w:proofErr w:type="spellStart"/>
-      <w:r>
-        <w:rPr>
-          <w:color w:val="EE0000"/>
-          <w:sz w:val="22"/>
-          <w:szCs w:val="22"/>
-        </w:rPr>
-        <w:t>client_name</w:t>
-      </w:r>
-      <w:proofErr w:type="spellEnd"/>
-      <w:r>
-        <w:rPr>
-          <w:color w:val="EE0000"/>
-          <w:sz w:val="22"/>
-          <w:szCs w:val="22"/>
-        </w:rPr>
-        <w:t xml:space="preserve"> </w:t>
-      </w:r>
-      <w:proofErr w:type="gramStart"/>
-      <w:r>
-        <w:rPr>
-          <w:color w:val="EE0000"/>
-          <w:sz w:val="22"/>
-          <w:szCs w:val="22"/>
-        </w:rPr>
-        <w:t>VARCHAR(</w:t>
-      </w:r>
-      <w:proofErr w:type="gramEnd"/>
-      <w:r>
-        <w:rPr>
-          <w:color w:val="EE0000"/>
-          <w:sz w:val="22"/>
-          <w:szCs w:val="22"/>
-        </w:rPr>
-        <w:t>20),</w:t>
-      </w:r>
-    </w:p>
-    <w:p>
-      <w:pPr>
-        <w:rPr>
-          <w:color w:val="EE0000"/>
-          <w:sz w:val="22"/>
-          <w:szCs w:val="22"/>
-        </w:rPr>
-      </w:pPr>
-      <w:r>
-        <w:rPr>
-          <w:color w:val="EE0000"/>
-          <w:sz w:val="22"/>
-          <w:szCs w:val="22"/>
-        </w:rPr>
-        <w:t xml:space="preserve">    </w:t>
-      </w:r>
-      <w:proofErr w:type="spellStart"/>
-      <w:r>
-        <w:rPr>
-          <w:color w:val="EE0000"/>
-          <w:sz w:val="22"/>
-          <w:szCs w:val="22"/>
-        </w:rPr>
-        <w:t>branch_id</w:t>
-      </w:r>
-      <w:proofErr w:type="spellEnd"/>
-      <w:r>
-        <w:rPr>
-          <w:color w:val="EE0000"/>
-          <w:sz w:val="22"/>
-          <w:szCs w:val="22"/>
-        </w:rPr>
-        <w:t xml:space="preserve"> INT,</w:t>
+        <w:t>CREATE TABLE client(</w:t>
+      </w:r>
+    </w:p>
+    <w:p>
+      <w:pPr>
+        <w:rPr>
+          <w:color w:val="EE0000"/>
+          <w:sz w:val="22"/>
+          <w:szCs w:val="22"/>
+        </w:rPr>
+      </w:pPr>
+      <w:r>
+        <w:rPr>
+          <w:color w:val="EE0000"/>
+          <w:sz w:val="22"/>
+          <w:szCs w:val="22"/>
+        </w:rPr>
+        <w:t>    client_id INT PRIMARY KEY,</w:t>
+      </w:r>
+    </w:p>
+    <w:p>
+      <w:pPr>
+        <w:rPr>
+          <w:color w:val="EE0000"/>
+          <w:sz w:val="22"/>
+          <w:szCs w:val="22"/>
+        </w:rPr>
+      </w:pPr>
+      <w:r>
+        <w:rPr>
+          <w:color w:val="EE0000"/>
+          <w:sz w:val="22"/>
+          <w:szCs w:val="22"/>
+        </w:rPr>
+        <w:t>    client_name VARCHAR(20),</w:t>
+      </w:r>
+    </w:p>
+    <w:p>
+      <w:pPr>
+        <w:rPr>
+          <w:color w:val="EE0000"/>
+          <w:sz w:val="22"/>
+          <w:szCs w:val="22"/>
+        </w:rPr>
+      </w:pPr>
+      <w:r>
+        <w:rPr>
+          <w:color w:val="EE0000"/>
+          <w:sz w:val="22"/>
+          <w:szCs w:val="22"/>
+        </w:rPr>
+        <w:t>    branch_id INT,</w:t>
       </w:r>
     </w:p>
     <w:p>
@@ -3432,43 +2604,7 @@
           <w:szCs w:val="22"/>
         </w:rPr>
         <w:lastRenderedPageBreak/>
-        <w:t>    FOREIGN KEY (</w:t>
-      </w:r>
-      <w:proofErr w:type="spellStart"/>
-      <w:r>
-        <w:rPr>
-          <w:color w:val="EE0000"/>
-          <w:sz w:val="22"/>
-          <w:szCs w:val="22"/>
-        </w:rPr>
-        <w:t>branch_id</w:t>
-      </w:r>
-      <w:proofErr w:type="spellEnd"/>
-      <w:r>
-        <w:rPr>
-          <w:color w:val="EE0000"/>
-          <w:sz w:val="22"/>
-          <w:szCs w:val="22"/>
-        </w:rPr>
-        <w:t>) REFERENCES branch(</w:t>
-      </w:r>
-      <w:proofErr w:type="spellStart"/>
-      <w:r>
-        <w:rPr>
-          <w:color w:val="EE0000"/>
-          <w:sz w:val="22"/>
-          <w:szCs w:val="22"/>
-        </w:rPr>
-        <w:t>branch_id</w:t>
-      </w:r>
-      <w:proofErr w:type="spellEnd"/>
-      <w:r>
-        <w:rPr>
-          <w:color w:val="EE0000"/>
-          <w:sz w:val="22"/>
-          <w:szCs w:val="22"/>
-        </w:rPr>
-        <w:t>) ON DELETE SET NULL</w:t>
+        <w:t>    FOREIGN KEY (branch_id) REFERENCES branch(branch_id) ON DELETE SET NULL</w:t>
       </w:r>
     </w:p>
     <w:p>
@@ -3511,289 +2647,109 @@
           <w:sz w:val="22"/>
           <w:szCs w:val="22"/>
         </w:rPr>
-        <w:t xml:space="preserve">CREATE TABLE </w:t>
-      </w:r>
-      <w:proofErr w:type="spellStart"/>
-      <w:r>
-        <w:rPr>
-          <w:color w:val="EE0000"/>
-          <w:sz w:val="22"/>
-          <w:szCs w:val="22"/>
-        </w:rPr>
-        <w:t>work_with</w:t>
-      </w:r>
-      <w:proofErr w:type="spellEnd"/>
-      <w:r>
-        <w:rPr>
-          <w:color w:val="EE0000"/>
-          <w:sz w:val="22"/>
-          <w:szCs w:val="22"/>
-        </w:rPr>
-        <w:t xml:space="preserve"> (</w:t>
-      </w:r>
-    </w:p>
-    <w:p>
-      <w:pPr>
-        <w:rPr>
-          <w:color w:val="EE0000"/>
-          <w:sz w:val="22"/>
-          <w:szCs w:val="22"/>
-        </w:rPr>
-      </w:pPr>
-      <w:r>
-        <w:rPr>
-          <w:color w:val="EE0000"/>
-          <w:sz w:val="22"/>
-          <w:szCs w:val="22"/>
-        </w:rPr>
-        <w:t xml:space="preserve">    </w:t>
-      </w:r>
-      <w:proofErr w:type="spellStart"/>
-      <w:r>
-        <w:rPr>
-          <w:color w:val="EE0000"/>
-          <w:sz w:val="22"/>
-          <w:szCs w:val="22"/>
-        </w:rPr>
-        <w:t>emp_id</w:t>
-      </w:r>
-      <w:proofErr w:type="spellEnd"/>
-      <w:r>
-        <w:rPr>
-          <w:color w:val="EE0000"/>
-          <w:sz w:val="22"/>
-          <w:szCs w:val="22"/>
-        </w:rPr>
-        <w:t xml:space="preserve"> INT,</w:t>
-      </w:r>
-    </w:p>
-    <w:p>
-      <w:pPr>
-        <w:rPr>
-          <w:color w:val="EE0000"/>
-          <w:sz w:val="22"/>
-          <w:szCs w:val="22"/>
-        </w:rPr>
-      </w:pPr>
-      <w:r>
-        <w:rPr>
-          <w:color w:val="EE0000"/>
-          <w:sz w:val="22"/>
-          <w:szCs w:val="22"/>
-        </w:rPr>
-        <w:t xml:space="preserve">    </w:t>
-      </w:r>
-      <w:proofErr w:type="spellStart"/>
-      <w:r>
-        <w:rPr>
-          <w:color w:val="EE0000"/>
-          <w:sz w:val="22"/>
-          <w:szCs w:val="22"/>
-        </w:rPr>
-        <w:t>client_id</w:t>
-      </w:r>
-      <w:proofErr w:type="spellEnd"/>
-      <w:r>
-        <w:rPr>
-          <w:color w:val="EE0000"/>
-          <w:sz w:val="22"/>
-          <w:szCs w:val="22"/>
-        </w:rPr>
-        <w:t xml:space="preserve"> INT,</w:t>
-      </w:r>
-    </w:p>
-    <w:p>
-      <w:pPr>
-        <w:rPr>
-          <w:color w:val="EE0000"/>
-          <w:sz w:val="22"/>
-          <w:szCs w:val="22"/>
-        </w:rPr>
-      </w:pPr>
-      <w:r>
-        <w:rPr>
-          <w:color w:val="EE0000"/>
-          <w:sz w:val="22"/>
-          <w:szCs w:val="22"/>
-        </w:rPr>
-        <w:t xml:space="preserve">    </w:t>
-      </w:r>
-      <w:proofErr w:type="spellStart"/>
-      <w:r>
-        <w:rPr>
-          <w:color w:val="EE0000"/>
-          <w:sz w:val="22"/>
-          <w:szCs w:val="22"/>
-        </w:rPr>
-        <w:t>total_sales</w:t>
-      </w:r>
-      <w:proofErr w:type="spellEnd"/>
-      <w:r>
-        <w:rPr>
-          <w:color w:val="EE0000"/>
-          <w:sz w:val="22"/>
-          <w:szCs w:val="22"/>
-        </w:rPr>
-        <w:t xml:space="preserve"> INT,</w:t>
-      </w:r>
-    </w:p>
-    <w:p>
-      <w:pPr>
-        <w:rPr>
-          <w:color w:val="EE0000"/>
-          <w:sz w:val="22"/>
-          <w:szCs w:val="22"/>
-        </w:rPr>
-      </w:pPr>
-      <w:r>
-        <w:rPr>
-          <w:color w:val="EE0000"/>
-          <w:sz w:val="22"/>
-          <w:szCs w:val="22"/>
-        </w:rPr>
-        <w:t>    PRIMARY KEY (</w:t>
-      </w:r>
-      <w:proofErr w:type="spellStart"/>
-      <w:r>
-        <w:rPr>
-          <w:color w:val="EE0000"/>
-          <w:sz w:val="22"/>
-          <w:szCs w:val="22"/>
-        </w:rPr>
-        <w:t>emp_id</w:t>
-      </w:r>
-      <w:proofErr w:type="spellEnd"/>
-      <w:r>
-        <w:rPr>
-          <w:color w:val="EE0000"/>
-          <w:sz w:val="22"/>
-          <w:szCs w:val="22"/>
-        </w:rPr>
-        <w:t xml:space="preserve">, </w:t>
-      </w:r>
-      <w:proofErr w:type="spellStart"/>
-      <w:r>
-        <w:rPr>
-          <w:color w:val="EE0000"/>
-          <w:sz w:val="22"/>
-          <w:szCs w:val="22"/>
-        </w:rPr>
-        <w:t>client_id</w:t>
-      </w:r>
-      <w:proofErr w:type="spellEnd"/>
-      <w:r>
-        <w:rPr>
-          <w:color w:val="EE0000"/>
-          <w:sz w:val="22"/>
-          <w:szCs w:val="22"/>
-        </w:rPr>
-        <w:t>),</w:t>
-      </w:r>
-    </w:p>
-    <w:p>
-      <w:pPr>
-        <w:rPr>
-          <w:color w:val="EE0000"/>
-          <w:sz w:val="22"/>
-          <w:szCs w:val="22"/>
-        </w:rPr>
-      </w:pPr>
-      <w:r>
-        <w:rPr>
-          <w:color w:val="EE0000"/>
-          <w:sz w:val="22"/>
-          <w:szCs w:val="22"/>
-        </w:rPr>
-        <w:t>    FOREIGN KEY (</w:t>
-      </w:r>
-      <w:proofErr w:type="spellStart"/>
-      <w:r>
-        <w:rPr>
-          <w:color w:val="EE0000"/>
-          <w:sz w:val="22"/>
-          <w:szCs w:val="22"/>
-        </w:rPr>
-        <w:t>emp_id</w:t>
-      </w:r>
-      <w:proofErr w:type="spellEnd"/>
-      <w:r>
-        <w:rPr>
-          <w:color w:val="EE0000"/>
-          <w:sz w:val="22"/>
-          <w:szCs w:val="22"/>
-        </w:rPr>
-        <w:t>) REFERENCES employee(</w:t>
-      </w:r>
-      <w:proofErr w:type="spellStart"/>
-      <w:r>
-        <w:rPr>
-          <w:color w:val="EE0000"/>
-          <w:sz w:val="22"/>
-          <w:szCs w:val="22"/>
-        </w:rPr>
-        <w:t>emp_id</w:t>
-      </w:r>
-      <w:proofErr w:type="spellEnd"/>
-      <w:r>
-        <w:rPr>
-          <w:color w:val="EE0000"/>
-          <w:sz w:val="22"/>
-          <w:szCs w:val="22"/>
-        </w:rPr>
-        <w:t>) ON DELETE CASCADE,</w:t>
-      </w:r>
-    </w:p>
-    <w:p>
-      <w:pPr>
-        <w:rPr>
-          <w:color w:val="EE0000"/>
-          <w:sz w:val="22"/>
-          <w:szCs w:val="22"/>
-        </w:rPr>
-      </w:pPr>
-      <w:r>
-        <w:rPr>
-          <w:color w:val="EE0000"/>
-          <w:sz w:val="22"/>
-          <w:szCs w:val="22"/>
-        </w:rPr>
-        <w:t>    FOREIGN KEY (</w:t>
-      </w:r>
-      <w:proofErr w:type="spellStart"/>
-      <w:r>
-        <w:rPr>
-          <w:color w:val="EE0000"/>
-          <w:sz w:val="22"/>
-          <w:szCs w:val="22"/>
-        </w:rPr>
-        <w:t>client_id</w:t>
-      </w:r>
-      <w:proofErr w:type="spellEnd"/>
-      <w:r>
-        <w:rPr>
-          <w:color w:val="EE0000"/>
-          <w:sz w:val="22"/>
-          <w:szCs w:val="22"/>
-        </w:rPr>
-        <w:t>) REFERENCES client(</w:t>
-      </w:r>
-      <w:proofErr w:type="spellStart"/>
-      <w:r>
-        <w:rPr>
-          <w:color w:val="EE0000"/>
-          <w:sz w:val="22"/>
-          <w:szCs w:val="22"/>
-        </w:rPr>
-        <w:t>client_id</w:t>
-      </w:r>
-      <w:proofErr w:type="spellEnd"/>
-      <w:r>
-        <w:rPr>
-          <w:color w:val="EE0000"/>
-          <w:sz w:val="22"/>
-          <w:szCs w:val="22"/>
-        </w:rPr>
-        <w:t>) ON DELETE CASCADE</w:t>
+        <w:t>CREATE TABLE work_with (</w:t>
+      </w:r>
+    </w:p>
+    <w:p>
+      <w:pPr>
+        <w:rPr>
+          <w:color w:val="EE0000"/>
+          <w:sz w:val="22"/>
+          <w:szCs w:val="22"/>
+        </w:rPr>
+      </w:pPr>
+      <w:r>
+        <w:rPr>
+          <w:color w:val="EE0000"/>
+          <w:sz w:val="22"/>
+          <w:szCs w:val="22"/>
+        </w:rPr>
+        <w:t>    emp_id INT,</w:t>
+      </w:r>
+    </w:p>
+    <w:p>
+      <w:pPr>
+        <w:rPr>
+          <w:color w:val="EE0000"/>
+          <w:sz w:val="22"/>
+          <w:szCs w:val="22"/>
+        </w:rPr>
+      </w:pPr>
+      <w:r>
+        <w:rPr>
+          <w:color w:val="EE0000"/>
+          <w:sz w:val="22"/>
+          <w:szCs w:val="22"/>
+        </w:rPr>
+        <w:t>    client_id INT,</w:t>
+      </w:r>
+    </w:p>
+    <w:p>
+      <w:pPr>
+        <w:rPr>
+          <w:color w:val="EE0000"/>
+          <w:sz w:val="22"/>
+          <w:szCs w:val="22"/>
+        </w:rPr>
+      </w:pPr>
+      <w:r>
+        <w:rPr>
+          <w:color w:val="EE0000"/>
+          <w:sz w:val="22"/>
+          <w:szCs w:val="22"/>
+        </w:rPr>
+        <w:t>    total_sales INT,</w:t>
+      </w:r>
+    </w:p>
+    <w:p>
+      <w:pPr>
+        <w:rPr>
+          <w:color w:val="EE0000"/>
+          <w:sz w:val="22"/>
+          <w:szCs w:val="22"/>
+        </w:rPr>
+      </w:pPr>
+      <w:r>
+        <w:rPr>
+          <w:color w:val="EE0000"/>
+          <w:sz w:val="22"/>
+          <w:szCs w:val="22"/>
+        </w:rPr>
+        <w:t>    PRIMARY KEY (emp_id, client_id),</w:t>
+      </w:r>
+    </w:p>
+    <w:p>
+      <w:pPr>
+        <w:rPr>
+          <w:color w:val="EE0000"/>
+          <w:sz w:val="22"/>
+          <w:szCs w:val="22"/>
+        </w:rPr>
+      </w:pPr>
+      <w:r>
+        <w:rPr>
+          <w:color w:val="EE0000"/>
+          <w:sz w:val="22"/>
+          <w:szCs w:val="22"/>
+        </w:rPr>
+        <w:t>    FOREIGN KEY (emp_id) REFERENCES employee(emp_id) ON DELETE CASCADE,</w:t>
+      </w:r>
+    </w:p>
+    <w:p>
+      <w:pPr>
+        <w:rPr>
+          <w:color w:val="EE0000"/>
+          <w:sz w:val="22"/>
+          <w:szCs w:val="22"/>
+        </w:rPr>
+      </w:pPr>
+      <w:r>
+        <w:rPr>
+          <w:color w:val="EE0000"/>
+          <w:sz w:val="22"/>
+          <w:szCs w:val="22"/>
+        </w:rPr>
+        <w:t>    FOREIGN KEY (client_id) REFERENCES client(client_id) ON DELETE CASCADE</w:t>
       </w:r>
     </w:p>
     <w:p>
@@ -3836,292 +2792,92 @@
           <w:sz w:val="22"/>
           <w:szCs w:val="22"/>
         </w:rPr>
-        <w:t xml:space="preserve">CREATE TABLE </w:t>
-      </w:r>
-      <w:proofErr w:type="spellStart"/>
-      <w:r>
-        <w:rPr>
-          <w:color w:val="EE0000"/>
-          <w:sz w:val="22"/>
-          <w:szCs w:val="22"/>
-        </w:rPr>
-        <w:t>branch_</w:t>
-      </w:r>
-      <w:proofErr w:type="gramStart"/>
-      <w:r>
-        <w:rPr>
-          <w:color w:val="EE0000"/>
-          <w:sz w:val="22"/>
-          <w:szCs w:val="22"/>
-        </w:rPr>
-        <w:t>supplier</w:t>
-      </w:r>
-      <w:proofErr w:type="spellEnd"/>
-      <w:r>
-        <w:rPr>
-          <w:color w:val="EE0000"/>
-          <w:sz w:val="22"/>
-          <w:szCs w:val="22"/>
-        </w:rPr>
-        <w:t>(</w:t>
-      </w:r>
-      <w:proofErr w:type="gramEnd"/>
-    </w:p>
-    <w:p>
-      <w:pPr>
-        <w:rPr>
-          <w:color w:val="EE0000"/>
-          <w:sz w:val="22"/>
-          <w:szCs w:val="22"/>
-        </w:rPr>
-      </w:pPr>
-      <w:r>
-        <w:rPr>
-          <w:color w:val="EE0000"/>
-          <w:sz w:val="22"/>
-          <w:szCs w:val="22"/>
-        </w:rPr>
-        <w:t xml:space="preserve">    </w:t>
-      </w:r>
-      <w:proofErr w:type="spellStart"/>
-      <w:r>
-        <w:rPr>
-          <w:color w:val="EE0000"/>
-          <w:sz w:val="22"/>
-          <w:szCs w:val="22"/>
-        </w:rPr>
-        <w:t>branch_id</w:t>
-      </w:r>
-      <w:proofErr w:type="spellEnd"/>
-      <w:r>
-        <w:rPr>
-          <w:color w:val="EE0000"/>
-          <w:sz w:val="22"/>
-          <w:szCs w:val="22"/>
-        </w:rPr>
-        <w:t xml:space="preserve"> INT,</w:t>
-      </w:r>
-    </w:p>
-    <w:p>
-      <w:pPr>
-        <w:rPr>
-          <w:color w:val="EE0000"/>
-          <w:sz w:val="22"/>
-          <w:szCs w:val="22"/>
-        </w:rPr>
-      </w:pPr>
-      <w:r>
-        <w:rPr>
-          <w:color w:val="EE0000"/>
-          <w:sz w:val="22"/>
-          <w:szCs w:val="22"/>
-        </w:rPr>
-        <w:t xml:space="preserve">    </w:t>
-      </w:r>
-      <w:proofErr w:type="spellStart"/>
-      <w:r>
-        <w:rPr>
-          <w:color w:val="EE0000"/>
-          <w:sz w:val="22"/>
-          <w:szCs w:val="22"/>
-        </w:rPr>
-        <w:t>supplier_name</w:t>
-      </w:r>
-      <w:proofErr w:type="spellEnd"/>
-      <w:r>
-        <w:rPr>
-          <w:color w:val="EE0000"/>
-          <w:sz w:val="22"/>
-          <w:szCs w:val="22"/>
-        </w:rPr>
-        <w:t xml:space="preserve"> </w:t>
-      </w:r>
-      <w:proofErr w:type="gramStart"/>
-      <w:r>
-        <w:rPr>
-          <w:color w:val="EE0000"/>
-          <w:sz w:val="22"/>
-          <w:szCs w:val="22"/>
-        </w:rPr>
-        <w:t>VARCHAR(</w:t>
-      </w:r>
-      <w:proofErr w:type="gramEnd"/>
-      <w:r>
-        <w:rPr>
-          <w:color w:val="EE0000"/>
-          <w:sz w:val="22"/>
-          <w:szCs w:val="22"/>
-        </w:rPr>
-        <w:t>30),</w:t>
-      </w:r>
-    </w:p>
-    <w:p>
-      <w:pPr>
-        <w:rPr>
-          <w:color w:val="EE0000"/>
-          <w:sz w:val="22"/>
-          <w:szCs w:val="22"/>
-        </w:rPr>
-      </w:pPr>
-      <w:r>
-        <w:rPr>
-          <w:color w:val="EE0000"/>
-          <w:sz w:val="22"/>
-          <w:szCs w:val="22"/>
-        </w:rPr>
-        <w:t xml:space="preserve">    </w:t>
-      </w:r>
-      <w:proofErr w:type="spellStart"/>
-      <w:r>
-        <w:rPr>
-          <w:color w:val="EE0000"/>
-          <w:sz w:val="22"/>
-          <w:szCs w:val="22"/>
-        </w:rPr>
-        <w:t>supply_type</w:t>
-      </w:r>
-      <w:proofErr w:type="spellEnd"/>
-      <w:r>
-        <w:rPr>
-          <w:color w:val="EE0000"/>
-          <w:sz w:val="22"/>
-          <w:szCs w:val="22"/>
-        </w:rPr>
-        <w:t xml:space="preserve"> </w:t>
-      </w:r>
-      <w:proofErr w:type="gramStart"/>
-      <w:r>
-        <w:rPr>
-          <w:color w:val="EE0000"/>
-          <w:sz w:val="22"/>
-          <w:szCs w:val="22"/>
-        </w:rPr>
-        <w:t>VARCHAR(</w:t>
-      </w:r>
-      <w:proofErr w:type="gramEnd"/>
-      <w:r>
-        <w:rPr>
-          <w:color w:val="EE0000"/>
-          <w:sz w:val="22"/>
-          <w:szCs w:val="22"/>
-        </w:rPr>
-        <w:t>20),</w:t>
-      </w:r>
-    </w:p>
-    <w:p>
-      <w:pPr>
-        <w:rPr>
-          <w:color w:val="EE0000"/>
-          <w:sz w:val="22"/>
-          <w:szCs w:val="22"/>
-        </w:rPr>
-      </w:pPr>
-      <w:r>
-        <w:rPr>
-          <w:color w:val="EE0000"/>
-          <w:sz w:val="22"/>
-          <w:szCs w:val="22"/>
-        </w:rPr>
-        <w:t xml:space="preserve">    PRIMARY </w:t>
-      </w:r>
-      <w:proofErr w:type="gramStart"/>
-      <w:r>
-        <w:rPr>
-          <w:color w:val="EE0000"/>
-          <w:sz w:val="22"/>
-          <w:szCs w:val="22"/>
-        </w:rPr>
-        <w:t>KEY(</w:t>
-      </w:r>
-      <w:proofErr w:type="spellStart"/>
-      <w:proofErr w:type="gramEnd"/>
-      <w:r>
-        <w:rPr>
-          <w:color w:val="EE0000"/>
-          <w:sz w:val="22"/>
-          <w:szCs w:val="22"/>
-        </w:rPr>
-        <w:t>branch_id</w:t>
-      </w:r>
-      <w:proofErr w:type="spellEnd"/>
-      <w:r>
-        <w:rPr>
-          <w:color w:val="EE0000"/>
-          <w:sz w:val="22"/>
-          <w:szCs w:val="22"/>
-        </w:rPr>
-        <w:t xml:space="preserve">, </w:t>
-      </w:r>
-      <w:proofErr w:type="spellStart"/>
-      <w:r>
-        <w:rPr>
-          <w:color w:val="EE0000"/>
-          <w:sz w:val="22"/>
-          <w:szCs w:val="22"/>
-        </w:rPr>
-        <w:t>supplier_name</w:t>
-      </w:r>
-      <w:proofErr w:type="spellEnd"/>
-      <w:r>
-        <w:rPr>
-          <w:color w:val="EE0000"/>
-          <w:sz w:val="22"/>
-          <w:szCs w:val="22"/>
-        </w:rPr>
-        <w:t>),</w:t>
-      </w:r>
-    </w:p>
-    <w:p>
-      <w:pPr>
-        <w:rPr>
-          <w:color w:val="EE0000"/>
-          <w:sz w:val="22"/>
-          <w:szCs w:val="22"/>
-        </w:rPr>
-      </w:pPr>
-      <w:r>
-        <w:rPr>
-          <w:color w:val="EE0000"/>
-          <w:sz w:val="22"/>
-          <w:szCs w:val="22"/>
-        </w:rPr>
-        <w:t>    FOREIGN KEY (</w:t>
-      </w:r>
-      <w:proofErr w:type="spellStart"/>
-      <w:r>
-        <w:rPr>
-          <w:color w:val="EE0000"/>
-          <w:sz w:val="22"/>
-          <w:szCs w:val="22"/>
-        </w:rPr>
-        <w:t>branch_id</w:t>
-      </w:r>
-      <w:proofErr w:type="spellEnd"/>
-      <w:r>
-        <w:rPr>
-          <w:color w:val="EE0000"/>
-          <w:sz w:val="22"/>
-          <w:szCs w:val="22"/>
-        </w:rPr>
-        <w:t>) REFERENCES branch(</w:t>
-      </w:r>
-      <w:proofErr w:type="spellStart"/>
-      <w:r>
-        <w:rPr>
-          <w:color w:val="EE0000"/>
-          <w:sz w:val="22"/>
-          <w:szCs w:val="22"/>
-        </w:rPr>
-        <w:t>branch_id</w:t>
-      </w:r>
-      <w:proofErr w:type="spellEnd"/>
-      <w:r>
-        <w:rPr>
-          <w:color w:val="EE0000"/>
-          <w:sz w:val="22"/>
-          <w:szCs w:val="22"/>
-        </w:rPr>
-        <w:t>) ON DELETE CASCADE</w:t>
+        <w:t>CREATE TABLE branch_supplier(</w:t>
+      </w:r>
+    </w:p>
+    <w:p>
+      <w:pPr>
+        <w:rPr>
+          <w:color w:val="EE0000"/>
+          <w:sz w:val="22"/>
+          <w:szCs w:val="22"/>
+        </w:rPr>
+      </w:pPr>
+      <w:r>
+        <w:rPr>
+          <w:color w:val="EE0000"/>
+          <w:sz w:val="22"/>
+          <w:szCs w:val="22"/>
+        </w:rPr>
+        <w:t>    branch_id INT,</w:t>
+      </w:r>
+    </w:p>
+    <w:p>
+      <w:pPr>
+        <w:rPr>
+          <w:color w:val="EE0000"/>
+          <w:sz w:val="22"/>
+          <w:szCs w:val="22"/>
+        </w:rPr>
+      </w:pPr>
+      <w:r>
+        <w:rPr>
+          <w:color w:val="EE0000"/>
+          <w:sz w:val="22"/>
+          <w:szCs w:val="22"/>
+        </w:rPr>
+        <w:t>    supplier_name VARCHAR(30),</w:t>
+      </w:r>
+    </w:p>
+    <w:p>
+      <w:pPr>
+        <w:rPr>
+          <w:color w:val="EE0000"/>
+          <w:sz w:val="22"/>
+          <w:szCs w:val="22"/>
+        </w:rPr>
+      </w:pPr>
+      <w:r>
+        <w:rPr>
+          <w:color w:val="EE0000"/>
+          <w:sz w:val="22"/>
+          <w:szCs w:val="22"/>
+        </w:rPr>
+        <w:t>    supply_type VARCHAR(20),</w:t>
+      </w:r>
+    </w:p>
+    <w:p>
+      <w:pPr>
+        <w:rPr>
+          <w:color w:val="EE0000"/>
+          <w:sz w:val="22"/>
+          <w:szCs w:val="22"/>
+        </w:rPr>
+      </w:pPr>
+      <w:r>
+        <w:rPr>
+          <w:color w:val="EE0000"/>
+          <w:sz w:val="22"/>
+          <w:szCs w:val="22"/>
+        </w:rPr>
+        <w:t>    PRIMARY KEY(branch_id, supplier_name),</w:t>
+      </w:r>
+    </w:p>
+    <w:p>
+      <w:pPr>
+        <w:rPr>
+          <w:color w:val="EE0000"/>
+          <w:sz w:val="22"/>
+          <w:szCs w:val="22"/>
+        </w:rPr>
+      </w:pPr>
+      <w:r>
+        <w:rPr>
+          <w:color w:val="EE0000"/>
+          <w:sz w:val="22"/>
+          <w:szCs w:val="22"/>
+        </w:rPr>
+        <w:t>    FOREIGN KEY (branch_id) REFERENCES branch(branch_id) ON DELETE CASCADE</w:t>
       </w:r>
     </w:p>
     <w:p>
@@ -4949,25 +3705,7 @@
           <w:sz w:val="22"/>
           <w:szCs w:val="22"/>
         </w:rPr>
-        <w:t xml:space="preserve">it helps return how many </w:t>
-      </w:r>
-      <w:proofErr w:type="gramStart"/>
-      <w:r>
-        <w:rPr>
-          <w:color w:val="000000" w:themeColor="text1"/>
-          <w:sz w:val="22"/>
-          <w:szCs w:val="22"/>
-        </w:rPr>
-        <w:t>instance</w:t>
-      </w:r>
-      <w:proofErr w:type="gramEnd"/>
-      <w:r>
-        <w:rPr>
-          <w:color w:val="000000" w:themeColor="text1"/>
-          <w:sz w:val="22"/>
-          <w:szCs w:val="22"/>
-        </w:rPr>
-        <w:t xml:space="preserve"> of the column name we have</w:t>
+        <w:t>it helps return how many instance of the column name we have</w:t>
       </w:r>
     </w:p>
     <w:p>
@@ -5164,25 +3902,7 @@
           <w:sz w:val="22"/>
           <w:szCs w:val="22"/>
         </w:rPr>
-        <w:t xml:space="preserve">WHERE </w:t>
-      </w:r>
-      <w:proofErr w:type="spellStart"/>
-      <w:r>
-        <w:rPr>
-          <w:color w:val="EE0000"/>
-          <w:sz w:val="22"/>
-          <w:szCs w:val="22"/>
-        </w:rPr>
-        <w:t>client_name</w:t>
-      </w:r>
-      <w:proofErr w:type="spellEnd"/>
-      <w:r>
-        <w:rPr>
-          <w:color w:val="EE0000"/>
-          <w:sz w:val="22"/>
-          <w:szCs w:val="22"/>
-        </w:rPr>
-        <w:t xml:space="preserve"> LIKE '%LLC';</w:t>
+        <w:t>WHERE client_name LIKE '%LLC';</w:t>
       </w:r>
     </w:p>
     <w:p>
@@ -5277,41 +3997,13 @@
           <w:szCs w:val="22"/>
         </w:rPr>
       </w:pPr>
-      <w:proofErr w:type="gramStart"/>
-      <w:r>
-        <w:rPr>
-          <w:color w:val="000000" w:themeColor="text1"/>
-          <w:sz w:val="22"/>
-          <w:szCs w:val="22"/>
-        </w:rPr>
-        <w:t>So</w:t>
-      </w:r>
-      <w:proofErr w:type="gramEnd"/>
-      <w:r>
-        <w:rPr>
-          <w:color w:val="000000" w:themeColor="text1"/>
-          <w:sz w:val="22"/>
-          <w:szCs w:val="22"/>
-        </w:rPr>
-        <w:t xml:space="preserve"> in practice </w:t>
-      </w:r>
-      <w:proofErr w:type="gramStart"/>
-      <w:r>
-        <w:rPr>
-          <w:color w:val="000000" w:themeColor="text1"/>
-          <w:sz w:val="22"/>
-          <w:szCs w:val="22"/>
-        </w:rPr>
-        <w:t>its</w:t>
-      </w:r>
-      <w:proofErr w:type="gramEnd"/>
-      <w:r>
-        <w:rPr>
-          <w:color w:val="000000" w:themeColor="text1"/>
-          <w:sz w:val="22"/>
-          <w:szCs w:val="22"/>
-        </w:rPr>
-        <w:t xml:space="preserve"> better to use Union All. </w:t>
+      <w:r>
+        <w:rPr>
+          <w:color w:val="000000" w:themeColor="text1"/>
+          <w:sz w:val="22"/>
+          <w:szCs w:val="22"/>
+        </w:rPr>
+        <w:t xml:space="preserve">So in practice its better to use Union All. </w:t>
       </w:r>
     </w:p>
     <w:p>
@@ -5353,60 +4045,24 @@
           <w:sz w:val="22"/>
           <w:szCs w:val="22"/>
         </w:rPr>
-        <w:t xml:space="preserve">; </w:t>
-      </w:r>
-      <w:proofErr w:type="gramStart"/>
-      <w:r>
-        <w:rPr>
-          <w:color w:val="000000" w:themeColor="text1"/>
-          <w:sz w:val="22"/>
-          <w:szCs w:val="22"/>
-        </w:rPr>
-        <w:t>its</w:t>
-      </w:r>
-      <w:proofErr w:type="gramEnd"/>
-      <w:r>
-        <w:rPr>
-          <w:color w:val="000000" w:themeColor="text1"/>
-          <w:sz w:val="22"/>
-          <w:szCs w:val="22"/>
-        </w:rPr>
-        <w:t xml:space="preserve"> an idea that refers to applying filters in the select query before union to decrease the time consumed when a set Union is taking place.</w:t>
-      </w:r>
-    </w:p>
-    <w:p>
-      <w:pPr>
-        <w:rPr>
-          <w:color w:val="000000" w:themeColor="text1"/>
-          <w:sz w:val="22"/>
-          <w:szCs w:val="22"/>
-        </w:rPr>
-      </w:pPr>
-      <w:r>
-        <w:rPr>
-          <w:color w:val="000000" w:themeColor="text1"/>
-          <w:sz w:val="22"/>
-          <w:szCs w:val="22"/>
-        </w:rPr>
-        <w:t xml:space="preserve">Any union, should have the same </w:t>
-      </w:r>
-      <w:proofErr w:type="gramStart"/>
-      <w:r>
-        <w:rPr>
-          <w:color w:val="000000" w:themeColor="text1"/>
-          <w:sz w:val="22"/>
-          <w:szCs w:val="22"/>
-        </w:rPr>
-        <w:t>amount</w:t>
-      </w:r>
-      <w:proofErr w:type="gramEnd"/>
-      <w:r>
-        <w:rPr>
-          <w:color w:val="000000" w:themeColor="text1"/>
-          <w:sz w:val="22"/>
-          <w:szCs w:val="22"/>
-        </w:rPr>
-        <w:t xml:space="preserve"> of columns for all the unionized columns, the same data type as well. The order of columns here matter not the naming.</w:t>
+        <w:t>; its an idea that refers to applying filters in the select query before union to decrease the time consumed when a set Union is taking place.</w:t>
+      </w:r>
+    </w:p>
+    <w:p>
+      <w:pPr>
+        <w:rPr>
+          <w:color w:val="000000" w:themeColor="text1"/>
+          <w:sz w:val="22"/>
+          <w:szCs w:val="22"/>
+        </w:rPr>
+      </w:pPr>
+      <w:r>
+        <w:rPr>
+          <w:color w:val="000000" w:themeColor="text1"/>
+          <w:sz w:val="22"/>
+          <w:szCs w:val="22"/>
+        </w:rPr>
+        <w:t>Any union, should have the same amount of columns for all the unionized columns, the same data type as well. The order of columns here matter not the naming.</w:t>
       </w:r>
     </w:p>
     <w:p>
@@ -5509,43 +4165,7 @@
           <w:sz w:val="22"/>
           <w:szCs w:val="22"/>
         </w:rPr>
-        <w:t xml:space="preserve">SELECT </w:t>
-      </w:r>
-      <w:proofErr w:type="spellStart"/>
-      <w:r>
-        <w:rPr>
-          <w:color w:val="EE0000"/>
-          <w:sz w:val="22"/>
-          <w:szCs w:val="22"/>
-        </w:rPr>
-        <w:t>emp_id</w:t>
-      </w:r>
-      <w:proofErr w:type="spellEnd"/>
-      <w:r>
-        <w:rPr>
-          <w:color w:val="EE0000"/>
-          <w:sz w:val="22"/>
-          <w:szCs w:val="22"/>
-        </w:rPr>
-        <w:t xml:space="preserve"> AS id, </w:t>
-      </w:r>
-      <w:proofErr w:type="spellStart"/>
-      <w:r>
-        <w:rPr>
-          <w:color w:val="EE0000"/>
-          <w:sz w:val="22"/>
-          <w:szCs w:val="22"/>
-        </w:rPr>
-        <w:t>first_name</w:t>
-      </w:r>
-      <w:proofErr w:type="spellEnd"/>
-      <w:r>
-        <w:rPr>
-          <w:color w:val="EE0000"/>
-          <w:sz w:val="22"/>
-          <w:szCs w:val="22"/>
-        </w:rPr>
-        <w:t xml:space="preserve"> AS name, 'EMPLOYEE' AS type</w:t>
+        <w:t>SELECT emp_id AS id, first_name AS name, 'EMPLOYEE' AS type</w:t>
       </w:r>
       <w:r>
         <w:rPr>
@@ -5561,18 +4181,8 @@
           <w:sz w:val="22"/>
           <w:szCs w:val="22"/>
         </w:rPr>
-        <w:t xml:space="preserve">this here makes a new column called type after the AS, and assigns the row values of it to </w:t>
-      </w:r>
-      <w:proofErr w:type="spellStart"/>
-      <w:r>
-        <w:rPr>
-          <w:color w:val="000000" w:themeColor="text1"/>
-          <w:sz w:val="22"/>
-          <w:szCs w:val="22"/>
-        </w:rPr>
-        <w:t>EMPloyee</w:t>
-      </w:r>
-      <w:proofErr w:type="spellEnd"/>
+        <w:t>this here makes a new column called type after the AS, and assigns the row values of it to EMPloyee</w:t>
+      </w:r>
     </w:p>
     <w:p>
       <w:pPr>
@@ -5683,23 +4293,13 @@
           <w:szCs w:val="22"/>
         </w:rPr>
       </w:pPr>
-      <w:proofErr w:type="spellStart"/>
-      <w:r>
-        <w:rPr>
-          <w:color w:val="000000" w:themeColor="text1"/>
-          <w:sz w:val="22"/>
-          <w:szCs w:val="22"/>
-        </w:rPr>
-        <w:t>Outter</w:t>
-      </w:r>
-      <w:proofErr w:type="spellEnd"/>
-      <w:r>
-        <w:rPr>
-          <w:color w:val="000000" w:themeColor="text1"/>
-          <w:sz w:val="22"/>
-          <w:szCs w:val="22"/>
-        </w:rPr>
-        <w:t xml:space="preserve"> join means all the left table will be joined with the right table and the uncommon values will just be null</w:t>
+      <w:r>
+        <w:rPr>
+          <w:color w:val="000000" w:themeColor="text1"/>
+          <w:sz w:val="22"/>
+          <w:szCs w:val="22"/>
+        </w:rPr>
+        <w:t>Outter join means all the left table will be joined with the right table and the uncommon values will just be null</w:t>
       </w:r>
     </w:p>
     <w:p>
@@ -5724,72 +4324,34 @@
           <w:sz w:val="22"/>
           <w:szCs w:val="22"/>
         </w:rPr>
-        <w:t xml:space="preserve"> join is a cartesian product of those 2 </w:t>
-      </w:r>
-      <w:proofErr w:type="gramStart"/>
-      <w:r>
-        <w:rPr>
-          <w:color w:val="000000" w:themeColor="text1"/>
-          <w:sz w:val="22"/>
-          <w:szCs w:val="22"/>
-        </w:rPr>
-        <w:t>god</w:t>
-      </w:r>
-      <w:proofErr w:type="gramEnd"/>
-      <w:r>
-        <w:rPr>
-          <w:color w:val="000000" w:themeColor="text1"/>
-          <w:sz w:val="22"/>
-          <w:szCs w:val="22"/>
-        </w:rPr>
-        <w:t xml:space="preserve"> help us</w:t>
-      </w:r>
-    </w:p>
-    <w:p>
-      <w:pPr>
-        <w:rPr>
-          <w:color w:val="000000" w:themeColor="text1"/>
-          <w:sz w:val="22"/>
-          <w:szCs w:val="22"/>
-        </w:rPr>
-      </w:pPr>
-    </w:p>
-    <w:p>
-      <w:pPr>
-        <w:rPr>
-          <w:color w:val="000000" w:themeColor="text1"/>
-          <w:sz w:val="22"/>
-          <w:szCs w:val="22"/>
-        </w:rPr>
-      </w:pPr>
-      <w:r>
-        <w:rPr>
-          <w:color w:val="000000" w:themeColor="text1"/>
-          <w:sz w:val="22"/>
-          <w:szCs w:val="22"/>
-        </w:rPr>
-        <w:t xml:space="preserve">SELECT e.name, </w:t>
-      </w:r>
-      <w:proofErr w:type="spellStart"/>
-      <w:proofErr w:type="gramStart"/>
-      <w:r>
-        <w:rPr>
-          <w:color w:val="000000" w:themeColor="text1"/>
-          <w:sz w:val="22"/>
-          <w:szCs w:val="22"/>
-        </w:rPr>
-        <w:t>d.department</w:t>
-      </w:r>
-      <w:proofErr w:type="gramEnd"/>
-      <w:r>
-        <w:rPr>
-          <w:color w:val="000000" w:themeColor="text1"/>
-          <w:sz w:val="22"/>
-          <w:szCs w:val="22"/>
-        </w:rPr>
-        <w:t>_name</w:t>
-      </w:r>
-      <w:proofErr w:type="spellEnd"/>
+        <w:t xml:space="preserve"> join is a cartesian product of those 2 god help us</w:t>
+      </w:r>
+    </w:p>
+    <w:p>
+      <w:pPr>
+        <w:rPr>
+          <w:color w:val="000000" w:themeColor="text1"/>
+          <w:sz w:val="22"/>
+          <w:szCs w:val="22"/>
+        </w:rPr>
+      </w:pPr>
+    </w:p>
+    <w:p>
+      <w:pPr>
+        <w:rPr>
+          <w:color w:val="000000" w:themeColor="text1"/>
+          <w:sz w:val="22"/>
+          <w:szCs w:val="22"/>
+        </w:rPr>
+      </w:pPr>
+      <w:r>
+        <w:rPr>
+          <w:color w:val="000000" w:themeColor="text1"/>
+          <w:sz w:val="22"/>
+          <w:szCs w:val="22"/>
+        </w:rPr>
+        <w:t>SELECT e.name, d.department_name</w:t>
+      </w:r>
     </w:p>
     <w:p>
       <w:pPr>
@@ -5839,35 +4401,7 @@
           <w:sz w:val="22"/>
           <w:szCs w:val="22"/>
         </w:rPr>
-        <w:t xml:space="preserve">ON </w:t>
-      </w:r>
-      <w:proofErr w:type="spellStart"/>
-      <w:proofErr w:type="gramStart"/>
-      <w:r>
-        <w:rPr>
-          <w:color w:val="000000" w:themeColor="text1"/>
-          <w:sz w:val="22"/>
-          <w:szCs w:val="22"/>
-        </w:rPr>
-        <w:t>e.department</w:t>
-      </w:r>
-      <w:proofErr w:type="gramEnd"/>
-      <w:r>
-        <w:rPr>
-          <w:color w:val="000000" w:themeColor="text1"/>
-          <w:sz w:val="22"/>
-          <w:szCs w:val="22"/>
-        </w:rPr>
-        <w:t>_id</w:t>
-      </w:r>
-      <w:proofErr w:type="spellEnd"/>
-      <w:r>
-        <w:rPr>
-          <w:color w:val="000000" w:themeColor="text1"/>
-          <w:sz w:val="22"/>
-          <w:szCs w:val="22"/>
-        </w:rPr>
-        <w:t xml:space="preserve"> = d.id;</w:t>
+        <w:t>ON e.department_id = d.id;</w:t>
       </w:r>
     </w:p>
     <w:p>
@@ -5989,25 +4523,7 @@
           <w:szCs w:val="22"/>
         </w:rPr>
         <w:br/>
-        <w:t xml:space="preserve">WHERE salary &gt; (SELECT </w:t>
-      </w:r>
-      <w:proofErr w:type="gramStart"/>
-      <w:r>
-        <w:rPr>
-          <w:color w:val="EE0000"/>
-          <w:sz w:val="22"/>
-          <w:szCs w:val="22"/>
-        </w:rPr>
-        <w:t>AVG(</w:t>
-      </w:r>
-      <w:proofErr w:type="gramEnd"/>
-      <w:r>
-        <w:rPr>
-          <w:color w:val="EE0000"/>
-          <w:sz w:val="22"/>
-          <w:szCs w:val="22"/>
-        </w:rPr>
-        <w:t>salary) FROM employees);</w:t>
+        <w:t>WHERE salary &gt; (SELECT AVG(salary) FROM employees);</w:t>
       </w:r>
     </w:p>
     <w:p>
@@ -6080,25 +4596,7 @@
           <w:szCs w:val="22"/>
         </w:rPr>
         <w:br/>
-        <w:t xml:space="preserve">WHERE </w:t>
-      </w:r>
-      <w:proofErr w:type="spellStart"/>
-      <w:r>
-        <w:rPr>
-          <w:color w:val="EE0000"/>
-          <w:sz w:val="22"/>
-          <w:szCs w:val="22"/>
-        </w:rPr>
-        <w:t>department_id</w:t>
-      </w:r>
-      <w:proofErr w:type="spellEnd"/>
-      <w:r>
-        <w:rPr>
-          <w:color w:val="EE0000"/>
-          <w:sz w:val="22"/>
-          <w:szCs w:val="22"/>
-        </w:rPr>
-        <w:t xml:space="preserve"> = (</w:t>
+        <w:t>WHERE department_id = (</w:t>
       </w:r>
       <w:r>
         <w:rPr>
@@ -6199,25 +4697,7 @@
           <w:szCs w:val="22"/>
         </w:rPr>
         <w:br/>
-        <w:t xml:space="preserve">WHERE </w:t>
-      </w:r>
-      <w:proofErr w:type="spellStart"/>
-      <w:r>
-        <w:rPr>
-          <w:color w:val="EE0000"/>
-          <w:sz w:val="22"/>
-          <w:szCs w:val="22"/>
-        </w:rPr>
-        <w:t>department_id</w:t>
-      </w:r>
-      <w:proofErr w:type="spellEnd"/>
-      <w:r>
-        <w:rPr>
-          <w:color w:val="EE0000"/>
-          <w:sz w:val="22"/>
-          <w:szCs w:val="22"/>
-        </w:rPr>
-        <w:t xml:space="preserve"> IN (</w:t>
+        <w:t>WHERE department_id IN (</w:t>
       </w:r>
       <w:r>
         <w:rPr>
@@ -6317,25 +4797,7 @@
           <w:szCs w:val="22"/>
         </w:rPr>
         <w:br/>
-        <w:t xml:space="preserve">    SELECT </w:t>
-      </w:r>
-      <w:proofErr w:type="gramStart"/>
-      <w:r>
-        <w:rPr>
-          <w:color w:val="EE0000"/>
-          <w:sz w:val="22"/>
-          <w:szCs w:val="22"/>
-        </w:rPr>
-        <w:t>AVG(</w:t>
-      </w:r>
-      <w:proofErr w:type="gramEnd"/>
-      <w:r>
-        <w:rPr>
-          <w:color w:val="EE0000"/>
-          <w:sz w:val="22"/>
-          <w:szCs w:val="22"/>
-        </w:rPr>
-        <w:t>salary)</w:t>
+        <w:t xml:space="preserve">    SELECT AVG(salary)</w:t>
       </w:r>
       <w:r>
         <w:rPr>
@@ -6353,46 +4815,8 @@
           <w:szCs w:val="22"/>
         </w:rPr>
         <w:br/>
-        <w:t xml:space="preserve">    WHERE </w:t>
-      </w:r>
-      <w:proofErr w:type="spellStart"/>
-      <w:r>
-        <w:rPr>
-          <w:color w:val="EE0000"/>
-          <w:sz w:val="22"/>
-          <w:szCs w:val="22"/>
-        </w:rPr>
-        <w:t>department_id</w:t>
-      </w:r>
-      <w:proofErr w:type="spellEnd"/>
-      <w:r>
-        <w:rPr>
-          <w:color w:val="EE0000"/>
-          <w:sz w:val="22"/>
-          <w:szCs w:val="22"/>
-        </w:rPr>
-        <w:t xml:space="preserve"> = </w:t>
-      </w:r>
-      <w:proofErr w:type="spellStart"/>
-      <w:proofErr w:type="gramStart"/>
-      <w:r>
-        <w:rPr>
-          <w:color w:val="EE0000"/>
-          <w:sz w:val="22"/>
-          <w:szCs w:val="22"/>
-        </w:rPr>
-        <w:t>e.department</w:t>
-      </w:r>
-      <w:proofErr w:type="gramEnd"/>
-      <w:r>
-        <w:rPr>
-          <w:color w:val="EE0000"/>
-          <w:sz w:val="22"/>
-          <w:szCs w:val="22"/>
-        </w:rPr>
-        <w:t>_id</w:t>
-      </w:r>
-      <w:proofErr w:type="spellEnd"/>
+        <w:t xml:space="preserve">    WHERE department_id = e.department_id</w:t>
+      </w:r>
       <w:r>
         <w:rPr>
           <w:color w:val="EE0000"/>
@@ -6618,28 +5042,8 @@
           <w:szCs w:val="22"/>
         </w:rPr>
         <w:br/>
-        <w:t xml:space="preserve">    SELECT 1 FROM departments d WHERE d.id = </w:t>
-      </w:r>
-      <w:proofErr w:type="spellStart"/>
-      <w:proofErr w:type="gramStart"/>
-      <w:r>
-        <w:rPr>
-          <w:color w:val="000000" w:themeColor="text1"/>
-          <w:sz w:val="22"/>
-          <w:szCs w:val="22"/>
-        </w:rPr>
-        <w:t>e.department</w:t>
-      </w:r>
-      <w:proofErr w:type="gramEnd"/>
-      <w:r>
-        <w:rPr>
-          <w:color w:val="000000" w:themeColor="text1"/>
-          <w:sz w:val="22"/>
-          <w:szCs w:val="22"/>
-        </w:rPr>
-        <w:t>_id</w:t>
-      </w:r>
-      <w:proofErr w:type="spellEnd"/>
+        <w:t xml:space="preserve">    SELECT 1 FROM departments d WHERE d.id = e.department_id</w:t>
+      </w:r>
       <w:r>
         <w:rPr>
           <w:color w:val="000000" w:themeColor="text1"/>
@@ -6901,54 +5305,8 @@
           <w:szCs w:val="22"/>
         </w:rPr>
         <w:br/>
-        <w:t xml:space="preserve">    </w:t>
-      </w:r>
-      <w:proofErr w:type="gramStart"/>
-      <w:r>
-        <w:rPr>
-          <w:color w:val="000000" w:themeColor="text1"/>
-          <w:sz w:val="22"/>
-          <w:szCs w:val="22"/>
-        </w:rPr>
-        <w:t xml:space="preserve">   (</w:t>
-      </w:r>
-      <w:proofErr w:type="gramEnd"/>
-      <w:r>
-        <w:rPr>
-          <w:color w:val="000000" w:themeColor="text1"/>
-          <w:sz w:val="22"/>
-          <w:szCs w:val="22"/>
-        </w:rPr>
-        <w:t xml:space="preserve">SELECT </w:t>
-      </w:r>
-      <w:proofErr w:type="gramStart"/>
-      <w:r>
-        <w:rPr>
-          <w:color w:val="000000" w:themeColor="text1"/>
-          <w:sz w:val="22"/>
-          <w:szCs w:val="22"/>
-        </w:rPr>
-        <w:t>AVG(</w:t>
-      </w:r>
-      <w:proofErr w:type="gramEnd"/>
-      <w:r>
-        <w:rPr>
-          <w:color w:val="000000" w:themeColor="text1"/>
-          <w:sz w:val="22"/>
-          <w:szCs w:val="22"/>
-        </w:rPr>
-        <w:t xml:space="preserve">salary) FROM employees) AS </w:t>
-      </w:r>
-      <w:proofErr w:type="spellStart"/>
-      <w:r>
-        <w:rPr>
-          <w:color w:val="000000" w:themeColor="text1"/>
-          <w:sz w:val="22"/>
-          <w:szCs w:val="22"/>
-        </w:rPr>
-        <w:t>avg_salary</w:t>
-      </w:r>
-      <w:proofErr w:type="spellEnd"/>
+        <w:t xml:space="preserve">       (SELECT AVG(salary) FROM employees) AS avg_salary</w:t>
+      </w:r>
       <w:r>
         <w:rPr>
           <w:color w:val="000000" w:themeColor="text1"/>
@@ -7012,54 +5370,8 @@
           <w:szCs w:val="22"/>
         </w:rPr>
         <w:br/>
-        <w:t xml:space="preserve">    SELECT </w:t>
-      </w:r>
-      <w:proofErr w:type="spellStart"/>
-      <w:r>
-        <w:rPr>
-          <w:color w:val="000000" w:themeColor="text1"/>
-          <w:sz w:val="22"/>
-          <w:szCs w:val="22"/>
-        </w:rPr>
-        <w:t>department_id</w:t>
-      </w:r>
-      <w:proofErr w:type="spellEnd"/>
-      <w:r>
-        <w:rPr>
-          <w:color w:val="000000" w:themeColor="text1"/>
-          <w:sz w:val="22"/>
-          <w:szCs w:val="22"/>
-        </w:rPr>
-        <w:t xml:space="preserve">, </w:t>
-      </w:r>
-      <w:proofErr w:type="gramStart"/>
-      <w:r>
-        <w:rPr>
-          <w:color w:val="000000" w:themeColor="text1"/>
-          <w:sz w:val="22"/>
-          <w:szCs w:val="22"/>
-        </w:rPr>
-        <w:t>AVG(</w:t>
-      </w:r>
-      <w:proofErr w:type="gramEnd"/>
-      <w:r>
-        <w:rPr>
-          <w:color w:val="000000" w:themeColor="text1"/>
-          <w:sz w:val="22"/>
-          <w:szCs w:val="22"/>
-        </w:rPr>
-        <w:t xml:space="preserve">salary) AS </w:t>
-      </w:r>
-      <w:proofErr w:type="spellStart"/>
-      <w:r>
-        <w:rPr>
-          <w:color w:val="000000" w:themeColor="text1"/>
-          <w:sz w:val="22"/>
-          <w:szCs w:val="22"/>
-        </w:rPr>
-        <w:t>avg_sal</w:t>
-      </w:r>
-      <w:proofErr w:type="spellEnd"/>
+        <w:t xml:space="preserve">    SELECT department_id, AVG(salary) AS avg_sal</w:t>
+      </w:r>
       <w:r>
         <w:rPr>
           <w:color w:val="000000" w:themeColor="text1"/>
@@ -7076,18 +5388,8 @@
           <w:szCs w:val="22"/>
         </w:rPr>
         <w:br/>
-        <w:t xml:space="preserve">    GROUP BY </w:t>
-      </w:r>
-      <w:proofErr w:type="spellStart"/>
-      <w:r>
-        <w:rPr>
-          <w:color w:val="000000" w:themeColor="text1"/>
-          <w:sz w:val="22"/>
-          <w:szCs w:val="22"/>
-        </w:rPr>
-        <w:t>department_id</w:t>
-      </w:r>
-      <w:proofErr w:type="spellEnd"/>
+        <w:t xml:space="preserve">    GROUP BY department_id</w:t>
+      </w:r>
       <w:r>
         <w:rPr>
           <w:color w:val="000000" w:themeColor="text1"/>
@@ -7308,43 +5610,7 @@
           <w:sz w:val="22"/>
           <w:szCs w:val="22"/>
         </w:rPr>
-        <w:t xml:space="preserve"> For </w:t>
-      </w:r>
-      <w:proofErr w:type="gramStart"/>
-      <w:r>
-        <w:rPr>
-          <w:color w:val="000000" w:themeColor="text1"/>
-          <w:sz w:val="22"/>
-          <w:szCs w:val="22"/>
-        </w:rPr>
-        <w:t>instance</w:t>
-      </w:r>
-      <w:proofErr w:type="gramEnd"/>
-      <w:r>
-        <w:rPr>
-          <w:color w:val="000000" w:themeColor="text1"/>
-          <w:sz w:val="22"/>
-          <w:szCs w:val="22"/>
-        </w:rPr>
-        <w:t xml:space="preserve"> imagine we have a table called customers and this table has a column called customer id, now </w:t>
-      </w:r>
-      <w:proofErr w:type="gramStart"/>
-      <w:r>
-        <w:rPr>
-          <w:color w:val="000000" w:themeColor="text1"/>
-          <w:sz w:val="22"/>
-          <w:szCs w:val="22"/>
-        </w:rPr>
-        <w:t>lets</w:t>
-      </w:r>
-      <w:proofErr w:type="gramEnd"/>
-      <w:r>
-        <w:rPr>
-          <w:color w:val="000000" w:themeColor="text1"/>
-          <w:sz w:val="22"/>
-          <w:szCs w:val="22"/>
-        </w:rPr>
-        <w:t xml:space="preserve"> say we have another table called orders which uses this id as a foreign key, </w:t>
+        <w:t xml:space="preserve"> For instance imagine we have a table called customers and this table has a column called customer id, now lets say we have another table called orders which uses this id as a foreign key, </w:t>
       </w:r>
     </w:p>
     <w:p>
@@ -7369,25 +5635,7 @@
           <w:sz w:val="22"/>
           <w:szCs w:val="22"/>
         </w:rPr>
-        <w:t>FOREIGN KEY (</w:t>
-      </w:r>
-      <w:proofErr w:type="spellStart"/>
-      <w:r>
-        <w:rPr>
-          <w:color w:val="EE0000"/>
-          <w:sz w:val="22"/>
-          <w:szCs w:val="22"/>
-        </w:rPr>
-        <w:t>customer_id</w:t>
-      </w:r>
-      <w:proofErr w:type="spellEnd"/>
-      <w:r>
-        <w:rPr>
-          <w:color w:val="EE0000"/>
-          <w:sz w:val="22"/>
-          <w:szCs w:val="22"/>
-        </w:rPr>
-        <w:t>) REFRENCES customer(id) ON DELETE CASCAD</w:t>
+        <w:t>FOREIGN KEY (customer_id) REFRENCES customer(id) ON DELETE CASCAD</w:t>
       </w:r>
       <w:r>
         <w:rPr>
@@ -7421,16 +5669,7 @@
           <w:sz w:val="22"/>
           <w:szCs w:val="22"/>
         </w:rPr>
-        <w:t xml:space="preserve">ON DELETE SET </w:t>
-      </w:r>
-      <w:proofErr w:type="gramStart"/>
-      <w:r>
-        <w:rPr>
-          <w:color w:val="EE0000"/>
-          <w:sz w:val="22"/>
-          <w:szCs w:val="22"/>
-        </w:rPr>
-        <w:t xml:space="preserve">NULL; </w:t>
+        <w:t xml:space="preserve">ON DELETE SET NULL; </w:t>
       </w:r>
       <w:r>
         <w:rPr>
@@ -7446,16 +5685,7 @@
           <w:sz w:val="22"/>
           <w:szCs w:val="22"/>
         </w:rPr>
-        <w:t>sets</w:t>
-      </w:r>
-      <w:proofErr w:type="gramEnd"/>
-      <w:r>
-        <w:rPr>
-          <w:color w:val="000000" w:themeColor="text1"/>
-          <w:sz w:val="22"/>
-          <w:szCs w:val="22"/>
-        </w:rPr>
-        <w:t xml:space="preserve"> the foreign key into NULL once its entry is deleted in the parent table</w:t>
+        <w:t>sets the foreign key into NULL once its entry is deleted in the parent table</w:t>
       </w:r>
     </w:p>
     <w:p>
@@ -7597,6 +5827,246 @@
           <w:szCs w:val="22"/>
         </w:rPr>
       </w:pPr>
+    </w:p>
+    <w:p>
+      <w:pPr>
+        <w:rPr>
+          <w:color w:val="000000" w:themeColor="text1"/>
+          <w:sz w:val="22"/>
+          <w:szCs w:val="22"/>
+        </w:rPr>
+      </w:pPr>
+    </w:p>
+    <w:p>
+      <w:pPr>
+        <w:rPr>
+          <w:color w:val="000000" w:themeColor="text1"/>
+          <w:sz w:val="22"/>
+          <w:szCs w:val="22"/>
+        </w:rPr>
+      </w:pPr>
+    </w:p>
+    <w:p>
+      <w:pPr>
+        <w:rPr>
+          <w:color w:val="000000" w:themeColor="text1"/>
+          <w:sz w:val="22"/>
+          <w:szCs w:val="22"/>
+        </w:rPr>
+      </w:pPr>
+    </w:p>
+    <w:p>
+      <w:pPr>
+        <w:rPr>
+          <w:color w:val="000000" w:themeColor="text1"/>
+          <w:sz w:val="22"/>
+          <w:szCs w:val="22"/>
+        </w:rPr>
+      </w:pPr>
+    </w:p>
+    <w:p>
+      <w:pPr>
+        <w:jc w:val="center"/>
+        <w:rPr>
+          <w:b/>
+          <w:bCs/>
+          <w:color w:val="EE0000"/>
+          <w:sz w:val="32"/>
+          <w:szCs w:val="32"/>
+          <w:u w:val="single"/>
+        </w:rPr>
+      </w:pPr>
+      <w:r>
+        <w:rPr>
+          <w:b/>
+          <w:bCs/>
+          <w:color w:val="EE0000"/>
+          <w:sz w:val="32"/>
+          <w:szCs w:val="32"/>
+          <w:u w:val="single"/>
+        </w:rPr>
+        <w:lastRenderedPageBreak/>
+        <w:t>ER Diagram</w:t>
+      </w:r>
+    </w:p>
+    <w:p>
+      <w:pPr>
+        <w:rPr>
+          <w:color w:val="000000" w:themeColor="text1"/>
+          <w:sz w:val="22"/>
+          <w:szCs w:val="22"/>
+        </w:rPr>
+      </w:pPr>
+      <w:r>
+        <w:rPr>
+          <w:color w:val="000000" w:themeColor="text1"/>
+          <w:sz w:val="22"/>
+          <w:szCs w:val="22"/>
+        </w:rPr>
+        <w:t>A database scheme is simply the tables and what attributes (columns) are going to be in these tables, and how does these tables relate to each other</w:t>
+      </w:r>
+    </w:p>
+    <w:p>
+      <w:pPr>
+        <w:rPr>
+          <w:color w:val="000000" w:themeColor="text1"/>
+          <w:sz w:val="22"/>
+          <w:szCs w:val="22"/>
+        </w:rPr>
+      </w:pPr>
+      <w:r>
+        <w:rPr>
+          <w:color w:val="000000" w:themeColor="text1"/>
+          <w:sz w:val="22"/>
+          <w:szCs w:val="22"/>
+        </w:rPr>
+        <w:t>In this course’s design we represent the entity/ table as a square and the attributes as ovals connected to them</w:t>
+      </w:r>
+      <w:r>
+        <w:rPr>
+          <w:color w:val="000000" w:themeColor="text1"/>
+          <w:sz w:val="22"/>
+          <w:szCs w:val="22"/>
+        </w:rPr>
+        <w:t>, we can define a primary key by underlining it</w:t>
+      </w:r>
+    </w:p>
+    <w:p>
+      <w:pPr>
+        <w:rPr>
+          <w:color w:val="000000" w:themeColor="text1"/>
+          <w:sz w:val="22"/>
+          <w:szCs w:val="22"/>
+        </w:rPr>
+      </w:pPr>
+      <w:r>
+        <w:rPr>
+          <w:color w:val="000000" w:themeColor="text1"/>
+          <w:sz w:val="22"/>
+          <w:szCs w:val="22"/>
+        </w:rPr>
+        <w:t>Defining composite attributes: attributes that can be broken into sub attributes like name can be broken into first name and last name</w:t>
+      </w:r>
+    </w:p>
+    <w:p>
+      <w:pPr>
+        <w:rPr>
+          <w:color w:val="000000" w:themeColor="text1"/>
+          <w:sz w:val="22"/>
+          <w:szCs w:val="22"/>
+        </w:rPr>
+      </w:pPr>
+      <w:r>
+        <w:rPr>
+          <w:color w:val="000000" w:themeColor="text1"/>
+          <w:sz w:val="22"/>
+          <w:szCs w:val="22"/>
+        </w:rPr>
+        <w:t>Multi-valued attribute: columns that can have multi-values in each row representing it</w:t>
+      </w:r>
+    </w:p>
+    <w:p>
+      <w:pPr>
+        <w:rPr>
+          <w:color w:val="000000" w:themeColor="text1"/>
+          <w:sz w:val="22"/>
+          <w:szCs w:val="22"/>
+        </w:rPr>
+      </w:pPr>
+      <w:r>
+        <w:rPr>
+          <w:color w:val="000000" w:themeColor="text1"/>
+          <w:sz w:val="22"/>
+          <w:szCs w:val="22"/>
+        </w:rPr>
+        <w:t>A derived attribute: attribute that Is calculated from other attributes</w:t>
+      </w:r>
+    </w:p>
+    <w:p>
+      <w:pPr>
+        <w:rPr>
+          <w:color w:val="000000" w:themeColor="text1"/>
+          <w:sz w:val="22"/>
+          <w:szCs w:val="22"/>
+        </w:rPr>
+      </w:pPr>
+    </w:p>
+    <w:p>
+      <w:pPr>
+        <w:rPr>
+          <w:color w:val="000000" w:themeColor="text1"/>
+          <w:sz w:val="22"/>
+          <w:szCs w:val="22"/>
+        </w:rPr>
+      </w:pPr>
+      <w:r>
+        <w:rPr>
+          <w:color w:val="000000" w:themeColor="text1"/>
+          <w:sz w:val="22"/>
+          <w:szCs w:val="22"/>
+        </w:rPr>
+        <w:t>A relationship is a triangle shaped between 2 entities</w:t>
+      </w:r>
+      <w:r>
+        <w:rPr>
+          <w:color w:val="000000" w:themeColor="text1"/>
+          <w:sz w:val="22"/>
+          <w:szCs w:val="22"/>
+        </w:rPr>
+        <w:t>, single line means partial participation meaning that not all the students for example need to enroll in a class</w:t>
+      </w:r>
+    </w:p>
+    <w:p>
+      <w:pPr>
+        <w:rPr>
+          <w:color w:val="000000" w:themeColor="text1"/>
+          <w:sz w:val="22"/>
+          <w:szCs w:val="22"/>
+        </w:rPr>
+      </w:pPr>
+    </w:p>
+    <w:p>
+      <w:pPr>
+        <w:rPr>
+          <w:color w:val="000000" w:themeColor="text1"/>
+          <w:sz w:val="22"/>
+          <w:szCs w:val="22"/>
+        </w:rPr>
+      </w:pPr>
+      <w:r>
+        <w:rPr>
+          <w:color w:val="000000" w:themeColor="text1"/>
+          <w:sz w:val="22"/>
+          <w:szCs w:val="22"/>
+        </w:rPr>
+        <w:t>In cardinality relationship we have 1:1 , 1:N, N:M where both N and M representing many</w:t>
+      </w:r>
+    </w:p>
+    <w:p>
+      <w:pPr>
+        <w:rPr>
+          <w:color w:val="000000" w:themeColor="text1"/>
+          <w:sz w:val="22"/>
+          <w:szCs w:val="22"/>
+        </w:rPr>
+      </w:pPr>
+    </w:p>
+    <w:p>
+      <w:pPr>
+        <w:rPr>
+          <w:color w:val="000000" w:themeColor="text1"/>
+          <w:sz w:val="22"/>
+          <w:szCs w:val="22"/>
+        </w:rPr>
+      </w:pPr>
+      <w:r>
+        <w:rPr>
+          <w:color w:val="000000" w:themeColor="text1"/>
+          <w:sz w:val="22"/>
+          <w:szCs w:val="22"/>
+        </w:rPr>
+        <w:t>Weak entities: and entity that its sole existence depends on the existence of another entity for example an entity called exam, it cannot exist without an entity called class</w:t>
+      </w:r>
     </w:p>
     <w:sectPr>
       <w:pgSz w:w="12240" w:h="15840"/>
@@ -9610,6 +8080,7 @@
   <w:style w:type="character" w:default="1" w:styleId="DefaultParagraphFont">
     <w:name w:val="Default Paragraph Font"/>
     <w:uiPriority w:val="1"/>
+    <w:semiHidden/>
     <w:unhideWhenUsed/>
   </w:style>
   <w:style w:type="table" w:default="1" w:styleId="TableNormal">

</xml_diff>